<commit_message>
add laba 5, 6, 7
</commit_message>
<xml_diff>
--- a/laba1/Андреев_Артамонов_Пыхов_Воронин_ЛР1.docx
+++ b/laba1/Андреев_Артамонов_Пыхов_Воронин_ЛР1.docx
@@ -12,7 +12,6 @@
           <w14:ligatures w14:val="none"/>
         </w:rPr>
       </w:pPr>
-      <w:r/>
       <w:r>
         <w:t xml:space="preserve">1</w:t>
       </w:r>
@@ -33,13 +32,13 @@
       </w:r>
       <w:r>
         <w:rPr>
+          <w:highlight w:val="none"/>
           <w:lang w:val="ru-RU"/>
         </w:rPr>
       </w:r>
       <w:r>
         <w:rPr>
-          <w:highlight w:val="none"/>
-          <w:lang w:val="ru-RU"/>
+          <w14:ligatures w14:val="none"/>
         </w:rPr>
       </w:r>
     </w:p>
@@ -64,7 +63,12 @@
           <w:highlight w:val="none"/>
         </w:rPr>
       </w:r>
-      <w:r/>
+      <w:r>
+        <w:rPr>
+          <w:highlight w:val="none"/>
+          <w14:ligatures w14:val="none"/>
+        </w:rPr>
+      </w:r>
     </w:p>
     <w:p>
       <w:pPr>
@@ -91,10 +95,17 @@
           <w:lang w:val="ru-RU"/>
         </w:rPr>
       </w:r>
+      <w:r>
+        <w:rPr>
+          <w:highlight w:val="none"/>
+          <w:lang w:val="ru-RU"/>
+          <w14:ligatures w14:val="none"/>
+        </w:rPr>
+      </w:r>
     </w:p>
     <w:p>
       <w:pPr>
-        <w:pStyle w:val="1_709"/>
+        <w:pStyle w:val="892"/>
         <w:suppressLineNumbers w:val="false"/>
         <w:pBdr/>
         <w:spacing/>
@@ -128,10 +139,17 @@
           <w:lang w:val="ru-RU" w:bidi="ru-RU"/>
         </w:rPr>
       </w:r>
+      <w:r>
+        <w:rPr>
+          <w:rFonts w:ascii="0xProto Nerd Font" w:hAnsi="0xProto Nerd Font" w:cs="0xProto Nerd Font"/>
+          <w:sz w:val="22"/>
+          <w:szCs w:val="22"/>
+        </w:rPr>
+      </w:r>
     </w:p>
     <w:p>
       <w:pPr>
-        <w:pStyle w:val="1_709"/>
+        <w:pStyle w:val="892"/>
         <w:suppressLineNumbers w:val="false"/>
         <w:pBdr/>
         <w:spacing/>
@@ -165,10 +183,17 @@
           <w:lang w:val="ru-RU" w:bidi="ru-RU"/>
         </w:rPr>
       </w:r>
+      <w:r>
+        <w:rPr>
+          <w:rFonts w:ascii="0xProto Nerd Font" w:hAnsi="0xProto Nerd Font" w:cs="0xProto Nerd Font"/>
+          <w:sz w:val="22"/>
+          <w:szCs w:val="22"/>
+        </w:rPr>
+      </w:r>
     </w:p>
     <w:p>
       <w:pPr>
-        <w:pStyle w:val="1_709"/>
+        <w:pStyle w:val="892"/>
         <w:suppressLineNumbers w:val="false"/>
         <w:pBdr/>
         <w:spacing/>
@@ -202,10 +227,17 @@
           <w:lang w:val="ru-RU" w:bidi="ru-RU"/>
         </w:rPr>
       </w:r>
+      <w:r>
+        <w:rPr>
+          <w:rFonts w:ascii="0xProto Nerd Font" w:hAnsi="0xProto Nerd Font" w:cs="0xProto Nerd Font"/>
+          <w:sz w:val="22"/>
+          <w:szCs w:val="22"/>
+        </w:rPr>
+      </w:r>
     </w:p>
     <w:p>
       <w:pPr>
-        <w:pStyle w:val="1_709"/>
+        <w:pStyle w:val="892"/>
         <w:suppressLineNumbers w:val="false"/>
         <w:pBdr/>
         <w:spacing/>
@@ -239,10 +271,17 @@
           <w:lang w:val="ru-RU" w:bidi="ru-RU"/>
         </w:rPr>
       </w:r>
+      <w:r>
+        <w:rPr>
+          <w:rFonts w:ascii="0xProto Nerd Font" w:hAnsi="0xProto Nerd Font" w:cs="0xProto Nerd Font"/>
+          <w:sz w:val="22"/>
+          <w:szCs w:val="22"/>
+        </w:rPr>
+      </w:r>
     </w:p>
     <w:p>
       <w:pPr>
-        <w:pStyle w:val="1_709"/>
+        <w:pStyle w:val="892"/>
         <w:suppressLineNumbers w:val="false"/>
         <w:pBdr/>
         <w:spacing/>
@@ -276,10 +315,17 @@
           <w:lang w:val="ru-RU" w:bidi="ru-RU"/>
         </w:rPr>
       </w:r>
+      <w:r>
+        <w:rPr>
+          <w:rFonts w:ascii="0xProto Nerd Font" w:hAnsi="0xProto Nerd Font" w:cs="0xProto Nerd Font"/>
+          <w:sz w:val="22"/>
+          <w:szCs w:val="22"/>
+        </w:rPr>
+      </w:r>
     </w:p>
     <w:p>
       <w:pPr>
-        <w:pStyle w:val="1_709"/>
+        <w:pStyle w:val="892"/>
         <w:suppressLineNumbers w:val="false"/>
         <w:pBdr/>
         <w:spacing/>
@@ -313,10 +359,17 @@
           <w:lang w:val="ru-RU" w:bidi="ru-RU"/>
         </w:rPr>
       </w:r>
+      <w:r>
+        <w:rPr>
+          <w:rFonts w:ascii="0xProto Nerd Font" w:hAnsi="0xProto Nerd Font" w:cs="0xProto Nerd Font"/>
+          <w:sz w:val="22"/>
+          <w:szCs w:val="22"/>
+        </w:rPr>
+      </w:r>
     </w:p>
     <w:p>
       <w:pPr>
-        <w:pStyle w:val="1_709"/>
+        <w:pStyle w:val="892"/>
         <w:suppressLineNumbers w:val="false"/>
         <w:pBdr/>
         <w:spacing/>
@@ -349,10 +402,17 @@
           <w:lang w:val="ru-RU" w:bidi="ru-RU"/>
         </w:rPr>
       </w:r>
+      <w:r>
+        <w:rPr>
+          <w:rFonts w:ascii="0xProto Nerd Font" w:hAnsi="0xProto Nerd Font" w:cs="0xProto Nerd Font"/>
+          <w:sz w:val="22"/>
+          <w:szCs w:val="22"/>
+        </w:rPr>
+      </w:r>
     </w:p>
     <w:p>
       <w:pPr>
-        <w:pStyle w:val="1_709"/>
+        <w:pStyle w:val="892"/>
         <w:suppressLineNumbers w:val="false"/>
         <w:pBdr/>
         <w:spacing/>
@@ -386,10 +446,17 @@
           <w:lang w:val="ru-RU" w:bidi="ru-RU"/>
         </w:rPr>
       </w:r>
+      <w:r>
+        <w:rPr>
+          <w:rFonts w:ascii="0xProto Nerd Font" w:hAnsi="0xProto Nerd Font" w:cs="0xProto Nerd Font"/>
+          <w:sz w:val="22"/>
+          <w:szCs w:val="22"/>
+        </w:rPr>
+      </w:r>
     </w:p>
     <w:p>
       <w:pPr>
-        <w:pStyle w:val="1_709"/>
+        <w:pStyle w:val="892"/>
         <w:suppressLineNumbers w:val="false"/>
         <w:pBdr/>
         <w:spacing/>
@@ -423,10 +490,17 @@
           <w:lang w:val="ru-RU" w:bidi="ru-RU"/>
         </w:rPr>
       </w:r>
+      <w:r>
+        <w:rPr>
+          <w:rFonts w:ascii="0xProto Nerd Font" w:hAnsi="0xProto Nerd Font" w:cs="0xProto Nerd Font"/>
+          <w:sz w:val="22"/>
+          <w:szCs w:val="22"/>
+        </w:rPr>
+      </w:r>
     </w:p>
     <w:p>
       <w:pPr>
-        <w:pStyle w:val="1_709"/>
+        <w:pStyle w:val="892"/>
         <w:suppressLineNumbers w:val="false"/>
         <w:pBdr/>
         <w:spacing/>
@@ -460,10 +534,17 @@
           <w:lang w:val="ru-RU" w:bidi="ru-RU"/>
         </w:rPr>
       </w:r>
+      <w:r>
+        <w:rPr>
+          <w:rFonts w:ascii="0xProto Nerd Font" w:hAnsi="0xProto Nerd Font" w:cs="0xProto Nerd Font"/>
+          <w:sz w:val="22"/>
+          <w:szCs w:val="22"/>
+        </w:rPr>
+      </w:r>
     </w:p>
     <w:p>
       <w:pPr>
-        <w:pStyle w:val="1_709"/>
+        <w:pStyle w:val="892"/>
         <w:suppressLineNumbers w:val="false"/>
         <w:pBdr/>
         <w:spacing/>
@@ -497,10 +578,17 @@
           <w:lang w:val="ru-RU" w:bidi="ru-RU"/>
         </w:rPr>
       </w:r>
+      <w:r>
+        <w:rPr>
+          <w:rFonts w:ascii="0xProto Nerd Font" w:hAnsi="0xProto Nerd Font" w:cs="0xProto Nerd Font"/>
+          <w:sz w:val="22"/>
+          <w:szCs w:val="22"/>
+        </w:rPr>
+      </w:r>
     </w:p>
     <w:p>
       <w:pPr>
-        <w:pStyle w:val="1_709"/>
+        <w:pStyle w:val="892"/>
         <w:suppressLineNumbers w:val="false"/>
         <w:pBdr/>
         <w:spacing/>
@@ -534,10 +622,17 @@
           <w:lang w:val="ru-RU" w:bidi="ru-RU"/>
         </w:rPr>
       </w:r>
+      <w:r>
+        <w:rPr>
+          <w:rFonts w:ascii="0xProto Nerd Font" w:hAnsi="0xProto Nerd Font" w:cs="0xProto Nerd Font"/>
+          <w:sz w:val="22"/>
+          <w:szCs w:val="22"/>
+        </w:rPr>
+      </w:r>
     </w:p>
     <w:p>
       <w:pPr>
-        <w:pStyle w:val="1_709"/>
+        <w:pStyle w:val="892"/>
         <w:suppressLineNumbers w:val="false"/>
         <w:pBdr/>
         <w:spacing/>
@@ -570,10 +665,17 @@
           <w:lang w:val="ru-RU" w:bidi="ru-RU"/>
         </w:rPr>
       </w:r>
+      <w:r>
+        <w:rPr>
+          <w:rFonts w:ascii="0xProto Nerd Font" w:hAnsi="0xProto Nerd Font" w:cs="0xProto Nerd Font"/>
+          <w:sz w:val="22"/>
+          <w:szCs w:val="22"/>
+        </w:rPr>
+      </w:r>
     </w:p>
     <w:p>
       <w:pPr>
-        <w:pStyle w:val="1_709"/>
+        <w:pStyle w:val="892"/>
         <w:suppressLineNumbers w:val="false"/>
         <w:pBdr/>
         <w:spacing/>
@@ -607,10 +709,17 @@
           <w:lang w:val="ru-RU" w:bidi="ru-RU"/>
         </w:rPr>
       </w:r>
+      <w:r>
+        <w:rPr>
+          <w:rFonts w:ascii="0xProto Nerd Font" w:hAnsi="0xProto Nerd Font" w:cs="0xProto Nerd Font"/>
+          <w:sz w:val="22"/>
+          <w:szCs w:val="22"/>
+        </w:rPr>
+      </w:r>
     </w:p>
     <w:p>
       <w:pPr>
-        <w:pStyle w:val="1_709"/>
+        <w:pStyle w:val="892"/>
         <w:suppressLineNumbers w:val="false"/>
         <w:pBdr/>
         <w:spacing/>
@@ -644,10 +753,17 @@
           <w:lang w:val="ru-RU" w:bidi="ru-RU"/>
         </w:rPr>
       </w:r>
+      <w:r>
+        <w:rPr>
+          <w:rFonts w:ascii="0xProto Nerd Font" w:hAnsi="0xProto Nerd Font" w:cs="0xProto Nerd Font"/>
+          <w:sz w:val="22"/>
+          <w:szCs w:val="22"/>
+        </w:rPr>
+      </w:r>
     </w:p>
     <w:p>
       <w:pPr>
-        <w:pStyle w:val="1_709"/>
+        <w:pStyle w:val="892"/>
         <w:suppressLineNumbers w:val="false"/>
         <w:pBdr/>
         <w:spacing/>
@@ -681,10 +797,17 @@
           <w:lang w:val="ru-RU" w:bidi="ru-RU"/>
         </w:rPr>
       </w:r>
+      <w:r>
+        <w:rPr>
+          <w:rFonts w:ascii="0xProto Nerd Font" w:hAnsi="0xProto Nerd Font" w:cs="0xProto Nerd Font"/>
+          <w:sz w:val="22"/>
+          <w:szCs w:val="22"/>
+        </w:rPr>
+      </w:r>
     </w:p>
     <w:p>
       <w:pPr>
-        <w:pStyle w:val="1_709"/>
+        <w:pStyle w:val="892"/>
         <w:suppressLineNumbers w:val="false"/>
         <w:pBdr/>
         <w:spacing/>
@@ -718,10 +841,17 @@
           <w:lang w:val="ru-RU" w:bidi="ru-RU"/>
         </w:rPr>
       </w:r>
+      <w:r>
+        <w:rPr>
+          <w:rFonts w:ascii="0xProto Nerd Font" w:hAnsi="0xProto Nerd Font" w:cs="0xProto Nerd Font"/>
+          <w:sz w:val="22"/>
+          <w:szCs w:val="22"/>
+        </w:rPr>
+      </w:r>
     </w:p>
     <w:p>
       <w:pPr>
-        <w:pStyle w:val="1_709"/>
+        <w:pStyle w:val="892"/>
         <w:suppressLineNumbers w:val="false"/>
         <w:pBdr/>
         <w:spacing/>
@@ -755,10 +885,17 @@
           <w:lang w:val="ru-RU" w:bidi="ru-RU"/>
         </w:rPr>
       </w:r>
+      <w:r>
+        <w:rPr>
+          <w:rFonts w:ascii="0xProto Nerd Font" w:hAnsi="0xProto Nerd Font" w:cs="0xProto Nerd Font"/>
+          <w:sz w:val="22"/>
+          <w:szCs w:val="22"/>
+        </w:rPr>
+      </w:r>
     </w:p>
     <w:p>
       <w:pPr>
-        <w:pStyle w:val="1_709"/>
+        <w:pStyle w:val="892"/>
         <w:suppressLineNumbers w:val="false"/>
         <w:pBdr/>
         <w:spacing/>
@@ -791,10 +928,17 @@
           <w:lang w:val="ru-RU" w:bidi="ru-RU"/>
         </w:rPr>
       </w:r>
+      <w:r>
+        <w:rPr>
+          <w:rFonts w:ascii="0xProto Nerd Font" w:hAnsi="0xProto Nerd Font" w:cs="0xProto Nerd Font"/>
+          <w:sz w:val="22"/>
+          <w:szCs w:val="22"/>
+        </w:rPr>
+      </w:r>
     </w:p>
     <w:p>
       <w:pPr>
-        <w:pStyle w:val="1_709"/>
+        <w:pStyle w:val="892"/>
         <w:suppressLineNumbers w:val="false"/>
         <w:pBdr/>
         <w:spacing/>
@@ -828,10 +972,17 @@
           <w:lang w:val="ru-RU" w:bidi="ru-RU"/>
         </w:rPr>
       </w:r>
+      <w:r>
+        <w:rPr>
+          <w:rFonts w:ascii="0xProto Nerd Font" w:hAnsi="0xProto Nerd Font" w:cs="0xProto Nerd Font"/>
+          <w:sz w:val="22"/>
+          <w:szCs w:val="22"/>
+        </w:rPr>
+      </w:r>
     </w:p>
     <w:p>
       <w:pPr>
-        <w:pStyle w:val="1_709"/>
+        <w:pStyle w:val="892"/>
         <w:suppressLineNumbers w:val="false"/>
         <w:pBdr/>
         <w:spacing/>
@@ -865,10 +1016,17 @@
           <w:lang w:val="ru-RU" w:bidi="ru-RU"/>
         </w:rPr>
       </w:r>
+      <w:r>
+        <w:rPr>
+          <w:rFonts w:ascii="0xProto Nerd Font" w:hAnsi="0xProto Nerd Font" w:cs="0xProto Nerd Font"/>
+          <w:sz w:val="22"/>
+          <w:szCs w:val="22"/>
+        </w:rPr>
+      </w:r>
     </w:p>
     <w:p>
       <w:pPr>
-        <w:pStyle w:val="1_709"/>
+        <w:pStyle w:val="892"/>
         <w:suppressLineNumbers w:val="false"/>
         <w:pBdr/>
         <w:spacing/>
@@ -902,10 +1060,17 @@
           <w:lang w:val="ru-RU" w:bidi="ru-RU"/>
         </w:rPr>
       </w:r>
+      <w:r>
+        <w:rPr>
+          <w:rFonts w:ascii="0xProto Nerd Font" w:hAnsi="0xProto Nerd Font" w:cs="0xProto Nerd Font"/>
+          <w:sz w:val="22"/>
+          <w:szCs w:val="22"/>
+        </w:rPr>
+      </w:r>
     </w:p>
     <w:p>
       <w:pPr>
-        <w:pStyle w:val="1_709"/>
+        <w:pStyle w:val="892"/>
         <w:suppressLineNumbers w:val="false"/>
         <w:pBdr/>
         <w:spacing/>
@@ -939,10 +1104,17 @@
           <w:lang w:val="ru-RU" w:bidi="ru-RU"/>
         </w:rPr>
       </w:r>
+      <w:r>
+        <w:rPr>
+          <w:rFonts w:ascii="0xProto Nerd Font" w:hAnsi="0xProto Nerd Font" w:cs="0xProto Nerd Font"/>
+          <w:sz w:val="22"/>
+          <w:szCs w:val="22"/>
+        </w:rPr>
+      </w:r>
     </w:p>
     <w:p>
       <w:pPr>
-        <w:pStyle w:val="1_709"/>
+        <w:pStyle w:val="892"/>
         <w:suppressLineNumbers w:val="false"/>
         <w:pBdr/>
         <w:spacing/>
@@ -976,10 +1148,17 @@
           <w:lang w:val="ru-RU" w:bidi="ru-RU"/>
         </w:rPr>
       </w:r>
+      <w:r>
+        <w:rPr>
+          <w:rFonts w:ascii="0xProto Nerd Font" w:hAnsi="0xProto Nerd Font" w:cs="0xProto Nerd Font"/>
+          <w:sz w:val="22"/>
+          <w:szCs w:val="22"/>
+        </w:rPr>
+      </w:r>
     </w:p>
     <w:p>
       <w:pPr>
-        <w:pStyle w:val="1_709"/>
+        <w:pStyle w:val="892"/>
         <w:suppressLineNumbers w:val="false"/>
         <w:pBdr/>
         <w:spacing/>
@@ -1013,10 +1192,17 @@
           <w:lang w:val="ru-RU" w:bidi="ru-RU"/>
         </w:rPr>
       </w:r>
+      <w:r>
+        <w:rPr>
+          <w:rFonts w:ascii="0xProto Nerd Font" w:hAnsi="0xProto Nerd Font" w:cs="0xProto Nerd Font"/>
+          <w:sz w:val="22"/>
+          <w:szCs w:val="22"/>
+        </w:rPr>
+      </w:r>
     </w:p>
     <w:p>
       <w:pPr>
-        <w:pStyle w:val="1_709"/>
+        <w:pStyle w:val="892"/>
         <w:suppressLineNumbers w:val="false"/>
         <w:pBdr/>
         <w:spacing/>
@@ -1050,10 +1236,17 @@
           <w:lang w:val="ru-RU" w:bidi="ru-RU"/>
         </w:rPr>
       </w:r>
+      <w:r>
+        <w:rPr>
+          <w:rFonts w:ascii="0xProto Nerd Font" w:hAnsi="0xProto Nerd Font" w:cs="0xProto Nerd Font"/>
+          <w:sz w:val="22"/>
+          <w:szCs w:val="22"/>
+        </w:rPr>
+      </w:r>
     </w:p>
     <w:p>
       <w:pPr>
-        <w:pStyle w:val="1_709"/>
+        <w:pStyle w:val="892"/>
         <w:suppressLineNumbers w:val="false"/>
         <w:pBdr/>
         <w:spacing/>
@@ -1087,10 +1280,17 @@
           <w:lang w:val="ru-RU" w:bidi="ru-RU"/>
         </w:rPr>
       </w:r>
+      <w:r>
+        <w:rPr>
+          <w:rFonts w:ascii="0xProto Nerd Font" w:hAnsi="0xProto Nerd Font" w:cs="0xProto Nerd Font"/>
+          <w:sz w:val="22"/>
+          <w:szCs w:val="22"/>
+        </w:rPr>
+      </w:r>
     </w:p>
     <w:p>
       <w:pPr>
-        <w:pStyle w:val="1_709"/>
+        <w:pStyle w:val="892"/>
         <w:suppressLineNumbers w:val="false"/>
         <w:pBdr/>
         <w:spacing/>
@@ -1124,10 +1324,17 @@
           <w:lang w:val="ru-RU" w:bidi="ru-RU"/>
         </w:rPr>
       </w:r>
+      <w:r>
+        <w:rPr>
+          <w:rFonts w:ascii="0xProto Nerd Font" w:hAnsi="0xProto Nerd Font" w:cs="0xProto Nerd Font"/>
+          <w:sz w:val="22"/>
+          <w:szCs w:val="22"/>
+        </w:rPr>
+      </w:r>
     </w:p>
     <w:p>
       <w:pPr>
-        <w:pStyle w:val="1_709"/>
+        <w:pStyle w:val="892"/>
         <w:suppressLineNumbers w:val="false"/>
         <w:pBdr/>
         <w:spacing/>
@@ -1160,10 +1367,17 @@
           <w:lang w:val="ru-RU" w:bidi="ru-RU"/>
         </w:rPr>
       </w:r>
+      <w:r>
+        <w:rPr>
+          <w:rFonts w:ascii="0xProto Nerd Font" w:hAnsi="0xProto Nerd Font" w:cs="0xProto Nerd Font"/>
+          <w:sz w:val="22"/>
+          <w:szCs w:val="22"/>
+        </w:rPr>
+      </w:r>
     </w:p>
     <w:p>
       <w:pPr>
-        <w:pStyle w:val="1_709"/>
+        <w:pStyle w:val="892"/>
         <w:suppressLineNumbers w:val="false"/>
         <w:pBdr/>
         <w:spacing/>
@@ -1197,10 +1411,17 @@
           <w:lang w:val="ru-RU" w:bidi="ru-RU"/>
         </w:rPr>
       </w:r>
+      <w:r>
+        <w:rPr>
+          <w:rFonts w:ascii="0xProto Nerd Font" w:hAnsi="0xProto Nerd Font" w:cs="0xProto Nerd Font"/>
+          <w:sz w:val="22"/>
+          <w:szCs w:val="22"/>
+        </w:rPr>
+      </w:r>
     </w:p>
     <w:p>
       <w:pPr>
-        <w:pStyle w:val="1_709"/>
+        <w:pStyle w:val="892"/>
         <w:suppressLineNumbers w:val="false"/>
         <w:pBdr/>
         <w:spacing/>
@@ -1234,10 +1455,17 @@
           <w:lang w:val="ru-RU" w:bidi="ru-RU"/>
         </w:rPr>
       </w:r>
+      <w:r>
+        <w:rPr>
+          <w:rFonts w:ascii="0xProto Nerd Font" w:hAnsi="0xProto Nerd Font" w:cs="0xProto Nerd Font"/>
+          <w:sz w:val="22"/>
+          <w:szCs w:val="22"/>
+        </w:rPr>
+      </w:r>
     </w:p>
     <w:p>
       <w:pPr>
-        <w:pStyle w:val="1_709"/>
+        <w:pStyle w:val="892"/>
         <w:suppressLineNumbers w:val="false"/>
         <w:pBdr/>
         <w:spacing/>
@@ -1271,10 +1499,17 @@
           <w:lang w:val="ru-RU" w:bidi="ru-RU"/>
         </w:rPr>
       </w:r>
+      <w:r>
+        <w:rPr>
+          <w:rFonts w:ascii="0xProto Nerd Font" w:hAnsi="0xProto Nerd Font" w:cs="0xProto Nerd Font"/>
+          <w:sz w:val="22"/>
+          <w:szCs w:val="22"/>
+        </w:rPr>
+      </w:r>
     </w:p>
     <w:p>
       <w:pPr>
-        <w:pStyle w:val="1_709"/>
+        <w:pStyle w:val="892"/>
         <w:suppressLineNumbers w:val="false"/>
         <w:pBdr/>
         <w:spacing/>
@@ -1308,10 +1543,17 @@
           <w:lang w:val="ru-RU" w:bidi="ru-RU"/>
         </w:rPr>
       </w:r>
+      <w:r>
+        <w:rPr>
+          <w:rFonts w:ascii="0xProto Nerd Font" w:hAnsi="0xProto Nerd Font" w:cs="0xProto Nerd Font"/>
+          <w:sz w:val="22"/>
+          <w:szCs w:val="22"/>
+        </w:rPr>
+      </w:r>
     </w:p>
     <w:p>
       <w:pPr>
-        <w:pStyle w:val="1_709"/>
+        <w:pStyle w:val="892"/>
         <w:suppressLineNumbers w:val="false"/>
         <w:pBdr/>
         <w:spacing/>
@@ -1345,10 +1587,17 @@
           <w:lang w:val="ru-RU" w:bidi="ru-RU"/>
         </w:rPr>
       </w:r>
+      <w:r>
+        <w:rPr>
+          <w:rFonts w:ascii="0xProto Nerd Font" w:hAnsi="0xProto Nerd Font" w:cs="0xProto Nerd Font"/>
+          <w:sz w:val="22"/>
+          <w:szCs w:val="22"/>
+        </w:rPr>
+      </w:r>
     </w:p>
     <w:p>
       <w:pPr>
-        <w:pStyle w:val="1_709"/>
+        <w:pStyle w:val="892"/>
         <w:suppressLineNumbers w:val="false"/>
         <w:pBdr/>
         <w:spacing/>
@@ -1382,10 +1631,17 @@
           <w:lang w:val="ru-RU" w:bidi="ru-RU"/>
         </w:rPr>
       </w:r>
+      <w:r>
+        <w:rPr>
+          <w:rFonts w:ascii="0xProto Nerd Font" w:hAnsi="0xProto Nerd Font" w:cs="0xProto Nerd Font"/>
+          <w:sz w:val="22"/>
+          <w:szCs w:val="22"/>
+        </w:rPr>
+      </w:r>
     </w:p>
     <w:p>
       <w:pPr>
-        <w:pStyle w:val="1_709"/>
+        <w:pStyle w:val="892"/>
         <w:suppressLineNumbers w:val="false"/>
         <w:pBdr/>
         <w:spacing/>
@@ -1419,10 +1675,17 @@
           <w:lang w:val="ru-RU" w:bidi="ru-RU"/>
         </w:rPr>
       </w:r>
+      <w:r>
+        <w:rPr>
+          <w:rFonts w:ascii="0xProto Nerd Font" w:hAnsi="0xProto Nerd Font" w:cs="0xProto Nerd Font"/>
+          <w:sz w:val="22"/>
+          <w:szCs w:val="22"/>
+        </w:rPr>
+      </w:r>
     </w:p>
     <w:p>
       <w:pPr>
-        <w:pStyle w:val="1_709"/>
+        <w:pStyle w:val="892"/>
         <w:suppressLineNumbers w:val="false"/>
         <w:pBdr/>
         <w:spacing/>
@@ -1456,10 +1719,17 @@
           <w:lang w:val="ru-RU" w:bidi="ru-RU"/>
         </w:rPr>
       </w:r>
+      <w:r>
+        <w:rPr>
+          <w:rFonts w:ascii="0xProto Nerd Font" w:hAnsi="0xProto Nerd Font" w:cs="0xProto Nerd Font"/>
+          <w:sz w:val="22"/>
+          <w:szCs w:val="22"/>
+        </w:rPr>
+      </w:r>
     </w:p>
     <w:p>
       <w:pPr>
-        <w:pStyle w:val="1_709"/>
+        <w:pStyle w:val="892"/>
         <w:suppressLineNumbers w:val="false"/>
         <w:pBdr/>
         <w:spacing/>
@@ -1493,10 +1763,17 @@
           <w:lang w:val="ru-RU" w:bidi="ru-RU"/>
         </w:rPr>
       </w:r>
+      <w:r>
+        <w:rPr>
+          <w:rFonts w:ascii="0xProto Nerd Font" w:hAnsi="0xProto Nerd Font" w:cs="0xProto Nerd Font"/>
+          <w:sz w:val="22"/>
+          <w:szCs w:val="22"/>
+        </w:rPr>
+      </w:r>
     </w:p>
     <w:p>
       <w:pPr>
-        <w:pStyle w:val="1_709"/>
+        <w:pStyle w:val="892"/>
         <w:suppressLineNumbers w:val="false"/>
         <w:pBdr/>
         <w:spacing/>
@@ -1530,10 +1807,17 @@
           <w:lang w:val="ru-RU" w:bidi="ru-RU"/>
         </w:rPr>
       </w:r>
+      <w:r>
+        <w:rPr>
+          <w:rFonts w:ascii="0xProto Nerd Font" w:hAnsi="0xProto Nerd Font" w:cs="0xProto Nerd Font"/>
+          <w:sz w:val="22"/>
+          <w:szCs w:val="22"/>
+        </w:rPr>
+      </w:r>
     </w:p>
     <w:p>
       <w:pPr>
-        <w:pStyle w:val="1_709"/>
+        <w:pStyle w:val="892"/>
         <w:suppressLineNumbers w:val="false"/>
         <w:pBdr/>
         <w:spacing/>
@@ -1581,7 +1865,7 @@
     </w:p>
     <w:p>
       <w:pPr>
-        <w:pStyle w:val="1_709"/>
+        <w:pStyle w:val="892"/>
         <w:suppressLineNumbers w:val="false"/>
         <w:pBdr/>
         <w:spacing/>
@@ -1615,10 +1899,17 @@
           <w:lang w:val="ru-RU" w:bidi="ru-RU"/>
         </w:rPr>
       </w:r>
+      <w:r>
+        <w:rPr>
+          <w:rFonts w:ascii="0xProto Nerd Font" w:hAnsi="0xProto Nerd Font" w:cs="0xProto Nerd Font"/>
+          <w:sz w:val="22"/>
+          <w:szCs w:val="22"/>
+        </w:rPr>
+      </w:r>
     </w:p>
     <w:p>
       <w:pPr>
-        <w:pStyle w:val="1_709"/>
+        <w:pStyle w:val="892"/>
         <w:suppressLineNumbers w:val="false"/>
         <w:pBdr/>
         <w:spacing/>
@@ -1652,10 +1943,17 @@
           <w:lang w:val="ru-RU" w:bidi="ru-RU"/>
         </w:rPr>
       </w:r>
+      <w:r>
+        <w:rPr>
+          <w:rFonts w:ascii="0xProto Nerd Font" w:hAnsi="0xProto Nerd Font" w:cs="0xProto Nerd Font"/>
+          <w:sz w:val="22"/>
+          <w:szCs w:val="22"/>
+        </w:rPr>
+      </w:r>
     </w:p>
     <w:p>
       <w:pPr>
-        <w:pStyle w:val="1_709"/>
+        <w:pStyle w:val="892"/>
         <w:suppressLineNumbers w:val="false"/>
         <w:pBdr/>
         <w:spacing/>
@@ -1689,10 +1987,17 @@
           <w:lang w:val="ru-RU" w:bidi="ru-RU"/>
         </w:rPr>
       </w:r>
+      <w:r>
+        <w:rPr>
+          <w:rFonts w:ascii="0xProto Nerd Font" w:hAnsi="0xProto Nerd Font" w:cs="0xProto Nerd Font"/>
+          <w:sz w:val="22"/>
+          <w:szCs w:val="22"/>
+        </w:rPr>
+      </w:r>
     </w:p>
     <w:p>
       <w:pPr>
-        <w:pStyle w:val="1_709"/>
+        <w:pStyle w:val="892"/>
         <w:suppressLineNumbers w:val="false"/>
         <w:pBdr/>
         <w:spacing/>
@@ -1726,10 +2031,17 @@
           <w:lang w:val="ru-RU" w:bidi="ru-RU"/>
         </w:rPr>
       </w:r>
+      <w:r>
+        <w:rPr>
+          <w:rFonts w:ascii="0xProto Nerd Font" w:hAnsi="0xProto Nerd Font" w:cs="0xProto Nerd Font"/>
+          <w:sz w:val="22"/>
+          <w:szCs w:val="22"/>
+        </w:rPr>
+      </w:r>
     </w:p>
     <w:p>
       <w:pPr>
-        <w:pStyle w:val="1_709"/>
+        <w:pStyle w:val="892"/>
         <w:suppressLineNumbers w:val="false"/>
         <w:pBdr/>
         <w:spacing/>
@@ -1763,10 +2075,17 @@
           <w:lang w:val="ru-RU" w:bidi="ru-RU"/>
         </w:rPr>
       </w:r>
+      <w:r>
+        <w:rPr>
+          <w:rFonts w:ascii="0xProto Nerd Font" w:hAnsi="0xProto Nerd Font" w:cs="0xProto Nerd Font"/>
+          <w:sz w:val="22"/>
+          <w:szCs w:val="22"/>
+        </w:rPr>
+      </w:r>
     </w:p>
     <w:p>
       <w:pPr>
-        <w:pStyle w:val="1_709"/>
+        <w:pStyle w:val="892"/>
         <w:suppressLineNumbers w:val="false"/>
         <w:pBdr/>
         <w:spacing/>
@@ -1800,10 +2119,17 @@
           <w:lang w:val="ru-RU" w:bidi="ru-RU"/>
         </w:rPr>
       </w:r>
+      <w:r>
+        <w:rPr>
+          <w:rFonts w:ascii="0xProto Nerd Font" w:hAnsi="0xProto Nerd Font" w:cs="0xProto Nerd Font"/>
+          <w:sz w:val="22"/>
+          <w:szCs w:val="22"/>
+        </w:rPr>
+      </w:r>
     </w:p>
     <w:p>
       <w:pPr>
-        <w:pStyle w:val="1_709"/>
+        <w:pStyle w:val="892"/>
         <w:suppressLineNumbers w:val="false"/>
         <w:pBdr/>
         <w:spacing/>
@@ -1933,10 +2259,16 @@
           <w:highlight w:val="none"/>
         </w:rPr>
       </w:r>
+      <w:r>
+        <w:rPr>
+          <w:highlight w:val="none"/>
+          <w14:ligatures w14:val="none"/>
+        </w:rPr>
+      </w:r>
     </w:p>
     <w:p>
       <w:pPr>
-        <w:pStyle w:val="1_709"/>
+        <w:pStyle w:val="892"/>
         <w:pBdr/>
         <w:spacing/>
         <w:ind/>
@@ -1966,10 +2298,16 @@
           <w:lang w:val="ru-RU" w:bidi="ru-RU"/>
         </w:rPr>
       </w:r>
+      <w:r>
+        <w:rPr>
+          <w:sz w:val="22"/>
+          <w:szCs w:val="22"/>
+        </w:rPr>
+      </w:r>
     </w:p>
     <w:p>
       <w:pPr>
-        <w:pStyle w:val="1_709"/>
+        <w:pStyle w:val="892"/>
         <w:pBdr/>
         <w:spacing/>
         <w:ind/>
@@ -1999,10 +2337,16 @@
           <w:lang w:val="ru-RU" w:bidi="ru-RU"/>
         </w:rPr>
       </w:r>
+      <w:r>
+        <w:rPr>
+          <w:sz w:val="22"/>
+          <w:szCs w:val="22"/>
+        </w:rPr>
+      </w:r>
     </w:p>
     <w:p>
       <w:pPr>
-        <w:pStyle w:val="1_709"/>
+        <w:pStyle w:val="892"/>
         <w:pBdr/>
         <w:spacing/>
         <w:ind/>
@@ -2032,10 +2376,16 @@
           <w:lang w:val="ru-RU" w:bidi="ru-RU"/>
         </w:rPr>
       </w:r>
+      <w:r>
+        <w:rPr>
+          <w:sz w:val="22"/>
+          <w:szCs w:val="22"/>
+        </w:rPr>
+      </w:r>
     </w:p>
     <w:p>
       <w:pPr>
-        <w:pStyle w:val="1_709"/>
+        <w:pStyle w:val="892"/>
         <w:pBdr/>
         <w:spacing/>
         <w:ind/>
@@ -2064,10 +2414,16 @@
           <w:lang w:val="ru-RU" w:bidi="ru-RU"/>
         </w:rPr>
       </w:r>
+      <w:r>
+        <w:rPr>
+          <w:sz w:val="22"/>
+          <w:szCs w:val="22"/>
+        </w:rPr>
+      </w:r>
     </w:p>
     <w:p>
       <w:pPr>
-        <w:pStyle w:val="1_709"/>
+        <w:pStyle w:val="892"/>
         <w:pBdr/>
         <w:spacing/>
         <w:ind/>
@@ -2097,10 +2453,16 @@
           <w:lang w:val="ru-RU" w:bidi="ru-RU"/>
         </w:rPr>
       </w:r>
+      <w:r>
+        <w:rPr>
+          <w:sz w:val="22"/>
+          <w:szCs w:val="22"/>
+        </w:rPr>
+      </w:r>
     </w:p>
     <w:p>
       <w:pPr>
-        <w:pStyle w:val="1_709"/>
+        <w:pStyle w:val="892"/>
         <w:pBdr/>
         <w:spacing/>
         <w:ind/>
@@ -2130,10 +2492,16 @@
           <w:lang w:val="ru-RU" w:bidi="ru-RU"/>
         </w:rPr>
       </w:r>
+      <w:r>
+        <w:rPr>
+          <w:sz w:val="22"/>
+          <w:szCs w:val="22"/>
+        </w:rPr>
+      </w:r>
     </w:p>
     <w:p>
       <w:pPr>
-        <w:pStyle w:val="1_709"/>
+        <w:pStyle w:val="892"/>
         <w:pBdr/>
         <w:spacing/>
         <w:ind/>
@@ -2163,10 +2531,16 @@
           <w:lang w:val="ru-RU" w:bidi="ru-RU"/>
         </w:rPr>
       </w:r>
+      <w:r>
+        <w:rPr>
+          <w:sz w:val="22"/>
+          <w:szCs w:val="22"/>
+        </w:rPr>
+      </w:r>
     </w:p>
     <w:p>
       <w:pPr>
-        <w:pStyle w:val="1_709"/>
+        <w:pStyle w:val="892"/>
         <w:pBdr/>
         <w:spacing/>
         <w:ind/>
@@ -2196,10 +2570,16 @@
           <w:lang w:val="ru-RU" w:bidi="ru-RU"/>
         </w:rPr>
       </w:r>
+      <w:r>
+        <w:rPr>
+          <w:sz w:val="22"/>
+          <w:szCs w:val="22"/>
+        </w:rPr>
+      </w:r>
     </w:p>
     <w:p>
       <w:pPr>
-        <w:pStyle w:val="1_709"/>
+        <w:pStyle w:val="892"/>
         <w:pBdr/>
         <w:spacing/>
         <w:ind/>
@@ -2229,10 +2609,16 @@
           <w:lang w:val="ru-RU" w:bidi="ru-RU"/>
         </w:rPr>
       </w:r>
+      <w:r>
+        <w:rPr>
+          <w:sz w:val="22"/>
+          <w:szCs w:val="22"/>
+        </w:rPr>
+      </w:r>
     </w:p>
     <w:p>
       <w:pPr>
-        <w:pStyle w:val="1_709"/>
+        <w:pStyle w:val="892"/>
         <w:pBdr/>
         <w:spacing/>
         <w:ind/>
@@ -2262,10 +2648,16 @@
           <w:lang w:val="ru-RU" w:bidi="ru-RU"/>
         </w:rPr>
       </w:r>
+      <w:r>
+        <w:rPr>
+          <w:sz w:val="22"/>
+          <w:szCs w:val="22"/>
+        </w:rPr>
+      </w:r>
     </w:p>
     <w:p>
       <w:pPr>
-        <w:pStyle w:val="1_709"/>
+        <w:pStyle w:val="892"/>
         <w:pBdr/>
         <w:spacing/>
         <w:ind/>
@@ -2295,10 +2687,16 @@
           <w:lang w:val="ru-RU" w:bidi="ru-RU"/>
         </w:rPr>
       </w:r>
+      <w:r>
+        <w:rPr>
+          <w:sz w:val="22"/>
+          <w:szCs w:val="22"/>
+        </w:rPr>
+      </w:r>
     </w:p>
     <w:p>
       <w:pPr>
-        <w:pStyle w:val="1_709"/>
+        <w:pStyle w:val="892"/>
         <w:pBdr/>
         <w:spacing/>
         <w:ind/>
@@ -2327,10 +2725,16 @@
           <w:lang w:val="ru-RU" w:bidi="ru-RU"/>
         </w:rPr>
       </w:r>
+      <w:r>
+        <w:rPr>
+          <w:sz w:val="22"/>
+          <w:szCs w:val="22"/>
+        </w:rPr>
+      </w:r>
     </w:p>
     <w:p>
       <w:pPr>
-        <w:pStyle w:val="1_709"/>
+        <w:pStyle w:val="892"/>
         <w:pBdr/>
         <w:spacing/>
         <w:ind/>
@@ -2360,10 +2764,16 @@
           <w:lang w:val="ru-RU" w:bidi="ru-RU"/>
         </w:rPr>
       </w:r>
+      <w:r>
+        <w:rPr>
+          <w:sz w:val="22"/>
+          <w:szCs w:val="22"/>
+        </w:rPr>
+      </w:r>
     </w:p>
     <w:p>
       <w:pPr>
-        <w:pStyle w:val="1_709"/>
+        <w:pStyle w:val="892"/>
         <w:pBdr/>
         <w:spacing/>
         <w:ind/>
@@ -2393,10 +2803,16 @@
           <w:lang w:val="ru-RU" w:bidi="ru-RU"/>
         </w:rPr>
       </w:r>
+      <w:r>
+        <w:rPr>
+          <w:sz w:val="22"/>
+          <w:szCs w:val="22"/>
+        </w:rPr>
+      </w:r>
     </w:p>
     <w:p>
       <w:pPr>
-        <w:pStyle w:val="1_709"/>
+        <w:pStyle w:val="892"/>
         <w:pBdr/>
         <w:spacing/>
         <w:ind/>
@@ -2426,10 +2842,16 @@
           <w:lang w:val="ru-RU" w:bidi="ru-RU"/>
         </w:rPr>
       </w:r>
+      <w:r>
+        <w:rPr>
+          <w:sz w:val="22"/>
+          <w:szCs w:val="22"/>
+        </w:rPr>
+      </w:r>
     </w:p>
     <w:p>
       <w:pPr>
-        <w:pStyle w:val="1_709"/>
+        <w:pStyle w:val="892"/>
         <w:pBdr/>
         <w:spacing/>
         <w:ind/>
@@ -2459,10 +2881,16 @@
           <w:lang w:val="ru-RU" w:bidi="ru-RU"/>
         </w:rPr>
       </w:r>
+      <w:r>
+        <w:rPr>
+          <w:sz w:val="22"/>
+          <w:szCs w:val="22"/>
+        </w:rPr>
+      </w:r>
     </w:p>
     <w:p>
       <w:pPr>
-        <w:pStyle w:val="1_709"/>
+        <w:pStyle w:val="892"/>
         <w:pBdr/>
         <w:spacing/>
         <w:ind/>
@@ -2492,10 +2920,16 @@
           <w:lang w:val="ru-RU" w:bidi="ru-RU"/>
         </w:rPr>
       </w:r>
+      <w:r>
+        <w:rPr>
+          <w:sz w:val="22"/>
+          <w:szCs w:val="22"/>
+        </w:rPr>
+      </w:r>
     </w:p>
     <w:p>
       <w:pPr>
-        <w:pStyle w:val="1_709"/>
+        <w:pStyle w:val="892"/>
         <w:pBdr/>
         <w:spacing/>
         <w:ind/>
@@ -2525,10 +2959,16 @@
           <w:lang w:val="ru-RU" w:bidi="ru-RU"/>
         </w:rPr>
       </w:r>
+      <w:r>
+        <w:rPr>
+          <w:sz w:val="22"/>
+          <w:szCs w:val="22"/>
+        </w:rPr>
+      </w:r>
     </w:p>
     <w:p>
       <w:pPr>
-        <w:pStyle w:val="1_709"/>
+        <w:pStyle w:val="892"/>
         <w:pBdr/>
         <w:spacing/>
         <w:ind/>
@@ -2558,10 +2998,16 @@
           <w:lang w:val="ru-RU" w:bidi="ru-RU"/>
         </w:rPr>
       </w:r>
+      <w:r>
+        <w:rPr>
+          <w:sz w:val="22"/>
+          <w:szCs w:val="22"/>
+        </w:rPr>
+      </w:r>
     </w:p>
     <w:p>
       <w:pPr>
-        <w:pStyle w:val="1_709"/>
+        <w:pStyle w:val="892"/>
         <w:pBdr/>
         <w:spacing/>
         <w:ind/>
@@ -2591,10 +3037,16 @@
           <w:lang w:val="ru-RU" w:bidi="ru-RU"/>
         </w:rPr>
       </w:r>
+      <w:r>
+        <w:rPr>
+          <w:sz w:val="22"/>
+          <w:szCs w:val="22"/>
+        </w:rPr>
+      </w:r>
     </w:p>
     <w:p>
       <w:pPr>
-        <w:pStyle w:val="1_709"/>
+        <w:pStyle w:val="892"/>
         <w:pBdr/>
         <w:spacing/>
         <w:ind/>
@@ -2624,10 +3076,16 @@
           <w:lang w:val="ru-RU" w:bidi="ru-RU"/>
         </w:rPr>
       </w:r>
+      <w:r>
+        <w:rPr>
+          <w:sz w:val="22"/>
+          <w:szCs w:val="22"/>
+        </w:rPr>
+      </w:r>
     </w:p>
     <w:p>
       <w:pPr>
-        <w:pStyle w:val="1_709"/>
+        <w:pStyle w:val="892"/>
         <w:pBdr/>
         <w:spacing/>
         <w:ind/>
@@ -2657,10 +3115,16 @@
           <w:lang w:val="ru-RU" w:bidi="ru-RU"/>
         </w:rPr>
       </w:r>
+      <w:r>
+        <w:rPr>
+          <w:sz w:val="22"/>
+          <w:szCs w:val="22"/>
+        </w:rPr>
+      </w:r>
     </w:p>
     <w:p>
       <w:pPr>
-        <w:pStyle w:val="1_709"/>
+        <w:pStyle w:val="892"/>
         <w:pBdr/>
         <w:spacing/>
         <w:ind/>
@@ -2690,10 +3154,16 @@
           <w:lang w:val="ru-RU" w:bidi="ru-RU"/>
         </w:rPr>
       </w:r>
+      <w:r>
+        <w:rPr>
+          <w:sz w:val="22"/>
+          <w:szCs w:val="22"/>
+        </w:rPr>
+      </w:r>
     </w:p>
     <w:p>
       <w:pPr>
-        <w:pStyle w:val="1_709"/>
+        <w:pStyle w:val="892"/>
         <w:pBdr/>
         <w:spacing/>
         <w:ind/>
@@ -2723,10 +3193,16 @@
           <w:lang w:val="ru-RU" w:bidi="ru-RU"/>
         </w:rPr>
       </w:r>
+      <w:r>
+        <w:rPr>
+          <w:sz w:val="22"/>
+          <w:szCs w:val="22"/>
+        </w:rPr>
+      </w:r>
     </w:p>
     <w:p>
       <w:pPr>
-        <w:pStyle w:val="1_709"/>
+        <w:pStyle w:val="892"/>
         <w:pBdr/>
         <w:spacing/>
         <w:ind/>
@@ -2756,10 +3232,16 @@
           <w:lang w:val="ru-RU" w:bidi="ru-RU"/>
         </w:rPr>
       </w:r>
+      <w:r>
+        <w:rPr>
+          <w:sz w:val="22"/>
+          <w:szCs w:val="22"/>
+        </w:rPr>
+      </w:r>
     </w:p>
     <w:p>
       <w:pPr>
-        <w:pStyle w:val="1_709"/>
+        <w:pStyle w:val="892"/>
         <w:pBdr/>
         <w:spacing/>
         <w:ind/>
@@ -2789,11 +3271,17 @@
           <w:lang w:val="ru-RU" w:bidi="ru-RU"/>
         </w:rPr>
       </w:r>
+      <w:r>
+        <w:rPr>
+          <w:sz w:val="22"/>
+          <w:szCs w:val="22"/>
+        </w:rPr>
+      </w:r>
     </w:p>
     <w:p>
       <w:pPr>
         <w:pBdr/>
-        <w:shd w:val="nil"/>
+        <w:shd w:val="nil" w:color="auto"/>
         <w:spacing/>
         <w:ind/>
         <w:rPr>
@@ -2839,7 +3327,7 @@
     </w:p>
     <w:p>
       <w:pPr>
-        <w:pStyle w:val="1_709"/>
+        <w:pStyle w:val="892"/>
         <w:pBdr/>
         <w:spacing/>
         <w:ind/>
@@ -2869,10 +3357,16 @@
           <w:lang w:val="ru-RU" w:bidi="ru-RU"/>
         </w:rPr>
       </w:r>
+      <w:r>
+        <w:rPr>
+          <w:sz w:val="22"/>
+          <w:szCs w:val="22"/>
+        </w:rPr>
+      </w:r>
     </w:p>
     <w:p>
       <w:pPr>
-        <w:pStyle w:val="1_709"/>
+        <w:pStyle w:val="892"/>
         <w:pBdr/>
         <w:spacing/>
         <w:ind/>
@@ -2902,10 +3396,16 @@
           <w:lang w:val="ru-RU" w:bidi="ru-RU"/>
         </w:rPr>
       </w:r>
+      <w:r>
+        <w:rPr>
+          <w:sz w:val="22"/>
+          <w:szCs w:val="22"/>
+        </w:rPr>
+      </w:r>
     </w:p>
     <w:p>
       <w:pPr>
-        <w:pStyle w:val="1_709"/>
+        <w:pStyle w:val="892"/>
         <w:pBdr/>
         <w:spacing/>
         <w:ind/>
@@ -2935,10 +3435,16 @@
           <w:lang w:val="ru-RU" w:bidi="ru-RU"/>
         </w:rPr>
       </w:r>
+      <w:r>
+        <w:rPr>
+          <w:sz w:val="22"/>
+          <w:szCs w:val="22"/>
+        </w:rPr>
+      </w:r>
     </w:p>
     <w:p>
       <w:pPr>
-        <w:pStyle w:val="1_709"/>
+        <w:pStyle w:val="892"/>
         <w:pBdr/>
         <w:spacing/>
         <w:ind/>
@@ -2968,10 +3474,16 @@
           <w:lang w:val="ru-RU" w:bidi="ru-RU"/>
         </w:rPr>
       </w:r>
+      <w:r>
+        <w:rPr>
+          <w:sz w:val="22"/>
+          <w:szCs w:val="22"/>
+        </w:rPr>
+      </w:r>
     </w:p>
     <w:p>
       <w:pPr>
-        <w:pStyle w:val="1_709"/>
+        <w:pStyle w:val="892"/>
         <w:pBdr/>
         <w:spacing/>
         <w:ind/>
@@ -3001,10 +3513,16 @@
           <w:lang w:val="ru-RU" w:bidi="ru-RU"/>
         </w:rPr>
       </w:r>
+      <w:r>
+        <w:rPr>
+          <w:sz w:val="22"/>
+          <w:szCs w:val="22"/>
+        </w:rPr>
+      </w:r>
     </w:p>
     <w:p>
       <w:pPr>
-        <w:pStyle w:val="1_709"/>
+        <w:pStyle w:val="892"/>
         <w:pBdr/>
         <w:spacing/>
         <w:ind/>
@@ -3034,10 +3552,16 @@
           <w:lang w:val="ru-RU" w:bidi="ru-RU"/>
         </w:rPr>
       </w:r>
+      <w:r>
+        <w:rPr>
+          <w:sz w:val="22"/>
+          <w:szCs w:val="22"/>
+        </w:rPr>
+      </w:r>
     </w:p>
     <w:p>
       <w:pPr>
-        <w:pStyle w:val="1_709"/>
+        <w:pStyle w:val="892"/>
         <w:pBdr/>
         <w:spacing/>
         <w:ind/>
@@ -3067,10 +3591,16 @@
           <w:lang w:val="ru-RU" w:bidi="ru-RU"/>
         </w:rPr>
       </w:r>
+      <w:r>
+        <w:rPr>
+          <w:sz w:val="22"/>
+          <w:szCs w:val="22"/>
+        </w:rPr>
+      </w:r>
     </w:p>
     <w:p>
       <w:pPr>
-        <w:pStyle w:val="1_709"/>
+        <w:pStyle w:val="892"/>
         <w:pBdr/>
         <w:spacing/>
         <w:ind/>
@@ -3100,10 +3630,16 @@
           <w:lang w:val="ru-RU" w:bidi="ru-RU"/>
         </w:rPr>
       </w:r>
+      <w:r>
+        <w:rPr>
+          <w:sz w:val="22"/>
+          <w:szCs w:val="22"/>
+        </w:rPr>
+      </w:r>
     </w:p>
     <w:p>
       <w:pPr>
-        <w:pStyle w:val="1_709"/>
+        <w:pStyle w:val="892"/>
         <w:pBdr/>
         <w:spacing/>
         <w:ind/>
@@ -3133,10 +3669,16 @@
           <w:lang w:val="ru-RU" w:bidi="ru-RU"/>
         </w:rPr>
       </w:r>
+      <w:r>
+        <w:rPr>
+          <w:sz w:val="22"/>
+          <w:szCs w:val="22"/>
+        </w:rPr>
+      </w:r>
     </w:p>
     <w:p>
       <w:pPr>
-        <w:pStyle w:val="1_709"/>
+        <w:pStyle w:val="892"/>
         <w:pBdr/>
         <w:spacing/>
         <w:ind/>
@@ -3166,10 +3708,16 @@
           <w:lang w:val="ru-RU" w:bidi="ru-RU"/>
         </w:rPr>
       </w:r>
+      <w:r>
+        <w:rPr>
+          <w:sz w:val="22"/>
+          <w:szCs w:val="22"/>
+        </w:rPr>
+      </w:r>
     </w:p>
     <w:p>
       <w:pPr>
-        <w:pStyle w:val="1_709"/>
+        <w:pStyle w:val="892"/>
         <w:pBdr/>
         <w:spacing/>
         <w:ind/>
@@ -3199,10 +3747,16 @@
           <w:lang w:val="ru-RU" w:bidi="ru-RU"/>
         </w:rPr>
       </w:r>
+      <w:r>
+        <w:rPr>
+          <w:sz w:val="22"/>
+          <w:szCs w:val="22"/>
+        </w:rPr>
+      </w:r>
     </w:p>
     <w:p>
       <w:pPr>
-        <w:pStyle w:val="1_709"/>
+        <w:pStyle w:val="892"/>
         <w:pBdr/>
         <w:spacing/>
         <w:ind/>
@@ -3232,10 +3786,16 @@
           <w:lang w:val="ru-RU" w:bidi="ru-RU"/>
         </w:rPr>
       </w:r>
+      <w:r>
+        <w:rPr>
+          <w:sz w:val="22"/>
+          <w:szCs w:val="22"/>
+        </w:rPr>
+      </w:r>
     </w:p>
     <w:p>
       <w:pPr>
-        <w:pStyle w:val="1_709"/>
+        <w:pStyle w:val="892"/>
         <w:pBdr/>
         <w:spacing/>
         <w:ind/>
@@ -3265,10 +3825,16 @@
           <w:lang w:val="ru-RU" w:bidi="ru-RU"/>
         </w:rPr>
       </w:r>
+      <w:r>
+        <w:rPr>
+          <w:sz w:val="22"/>
+          <w:szCs w:val="22"/>
+        </w:rPr>
+      </w:r>
     </w:p>
     <w:p>
       <w:pPr>
-        <w:pStyle w:val="1_709"/>
+        <w:pStyle w:val="892"/>
         <w:pBdr/>
         <w:spacing/>
         <w:ind/>
@@ -3298,10 +3864,16 @@
           <w:lang w:val="ru-RU" w:bidi="ru-RU"/>
         </w:rPr>
       </w:r>
+      <w:r>
+        <w:rPr>
+          <w:sz w:val="22"/>
+          <w:szCs w:val="22"/>
+        </w:rPr>
+      </w:r>
     </w:p>
     <w:p>
       <w:pPr>
-        <w:pStyle w:val="1_709"/>
+        <w:pStyle w:val="892"/>
         <w:pBdr/>
         <w:spacing/>
         <w:ind/>
@@ -3331,10 +3903,16 @@
           <w:lang w:val="ru-RU" w:bidi="ru-RU"/>
         </w:rPr>
       </w:r>
+      <w:r>
+        <w:rPr>
+          <w:sz w:val="22"/>
+          <w:szCs w:val="22"/>
+        </w:rPr>
+      </w:r>
     </w:p>
     <w:p>
       <w:pPr>
-        <w:pStyle w:val="1_709"/>
+        <w:pStyle w:val="892"/>
         <w:pBdr/>
         <w:spacing/>
         <w:ind/>
@@ -3363,10 +3941,16 @@
           <w:lang w:val="ru-RU" w:bidi="ru-RU"/>
         </w:rPr>
       </w:r>
+      <w:r>
+        <w:rPr>
+          <w:sz w:val="22"/>
+          <w:szCs w:val="22"/>
+        </w:rPr>
+      </w:r>
     </w:p>
     <w:p>
       <w:pPr>
-        <w:pStyle w:val="1_709"/>
+        <w:pStyle w:val="892"/>
         <w:pBdr/>
         <w:spacing/>
         <w:ind/>
@@ -3396,10 +3980,16 @@
           <w:lang w:val="ru-RU" w:bidi="ru-RU"/>
         </w:rPr>
       </w:r>
+      <w:r>
+        <w:rPr>
+          <w:sz w:val="22"/>
+          <w:szCs w:val="22"/>
+        </w:rPr>
+      </w:r>
     </w:p>
     <w:p>
       <w:pPr>
-        <w:pStyle w:val="1_709"/>
+        <w:pStyle w:val="892"/>
         <w:pBdr/>
         <w:spacing/>
         <w:ind/>
@@ -3429,10 +4019,16 @@
           <w:lang w:val="ru-RU" w:bidi="ru-RU"/>
         </w:rPr>
       </w:r>
+      <w:r>
+        <w:rPr>
+          <w:sz w:val="22"/>
+          <w:szCs w:val="22"/>
+        </w:rPr>
+      </w:r>
     </w:p>
     <w:p>
       <w:pPr>
-        <w:pStyle w:val="1_709"/>
+        <w:pStyle w:val="892"/>
         <w:pBdr/>
         <w:spacing/>
         <w:ind/>
@@ -3462,10 +4058,16 @@
           <w:lang w:val="ru-RU" w:bidi="ru-RU"/>
         </w:rPr>
       </w:r>
+      <w:r>
+        <w:rPr>
+          <w:sz w:val="22"/>
+          <w:szCs w:val="22"/>
+        </w:rPr>
+      </w:r>
     </w:p>
     <w:p>
       <w:pPr>
-        <w:pStyle w:val="1_709"/>
+        <w:pStyle w:val="892"/>
         <w:pBdr/>
         <w:spacing/>
         <w:ind/>
@@ -3495,10 +4097,16 @@
           <w:lang w:val="ru-RU" w:bidi="ru-RU"/>
         </w:rPr>
       </w:r>
+      <w:r>
+        <w:rPr>
+          <w:sz w:val="22"/>
+          <w:szCs w:val="22"/>
+        </w:rPr>
+      </w:r>
     </w:p>
     <w:p>
       <w:pPr>
-        <w:pStyle w:val="1_709"/>
+        <w:pStyle w:val="892"/>
         <w:pBdr/>
         <w:spacing/>
         <w:ind/>
@@ -3528,10 +4136,16 @@
           <w:lang w:val="ru-RU" w:bidi="ru-RU"/>
         </w:rPr>
       </w:r>
+      <w:r>
+        <w:rPr>
+          <w:sz w:val="22"/>
+          <w:szCs w:val="22"/>
+        </w:rPr>
+      </w:r>
     </w:p>
     <w:p>
       <w:pPr>
-        <w:pStyle w:val="1_709"/>
+        <w:pStyle w:val="892"/>
         <w:pBdr/>
         <w:spacing/>
         <w:ind/>
@@ -3560,10 +4174,16 @@
           <w:lang w:val="ru-RU" w:bidi="ru-RU"/>
         </w:rPr>
       </w:r>
+      <w:r>
+        <w:rPr>
+          <w:sz w:val="22"/>
+          <w:szCs w:val="22"/>
+        </w:rPr>
+      </w:r>
     </w:p>
     <w:p>
       <w:pPr>
-        <w:pStyle w:val="1_709"/>
+        <w:pStyle w:val="892"/>
         <w:pBdr/>
         <w:spacing/>
         <w:ind/>
@@ -3593,10 +4213,16 @@
           <w:lang w:val="ru-RU" w:bidi="ru-RU"/>
         </w:rPr>
       </w:r>
+      <w:r>
+        <w:rPr>
+          <w:sz w:val="22"/>
+          <w:szCs w:val="22"/>
+        </w:rPr>
+      </w:r>
     </w:p>
     <w:p>
       <w:pPr>
-        <w:pStyle w:val="1_709"/>
+        <w:pStyle w:val="892"/>
         <w:pBdr/>
         <w:spacing/>
         <w:ind/>
@@ -3622,6 +4248,12 @@
       </w:r>
       <w:r>
         <w:rPr>
+          <w:sz w:val="18"/>
+          <w:szCs w:val="18"/>
+        </w:rPr>
+      </w:r>
+      <w:r>
+        <w:rPr>
           <w:b/>
           <w:bCs/>
           <w:sz w:val="22"/>
@@ -3630,56 +4262,46 @@
           <w:lang w:val="ru-RU" w:bidi="ru-RU"/>
         </w:rPr>
       </w:r>
-      <w:r>
+    </w:p>
+    <w:p>
+      <w:pPr>
+        <w:pBdr/>
+        <w:spacing/>
+        <w:ind/>
         <w:rPr>
           <w:sz w:val="18"/>
           <w:szCs w:val="18"/>
         </w:rPr>
+      </w:pPr>
+      <w:r>
+        <w:rPr>
+          <w:b/>
+          <w:bCs/>
+          <w:sz w:val="22"/>
+          <w:szCs w:val="22"/>
+          <w:highlight w:val="none"/>
+          <w:lang w:val="ru-RU" w:bidi="ru-RU"/>
+        </w:rPr>
+      </w:r>
+      <w:r>
+        <w:rPr>
+          <w:b/>
+          <w:bCs/>
+          <w:sz w:val="22"/>
+          <w:szCs w:val="22"/>
+          <w:highlight w:val="none"/>
+          <w:lang w:val="ru-RU" w:bidi="ru-RU"/>
+        </w:rPr>
+      </w:r>
+      <w:r>
+        <w:rPr>
+          <w:sz w:val="18"/>
+          <w:szCs w:val="18"/>
+        </w:rPr>
       </w:r>
     </w:p>
     <w:p>
       <w:pPr>
-        <w:pBdr/>
-        <w:spacing/>
-        <w:ind/>
-        <w:rPr>
-          <w:sz w:val="18"/>
-          <w:szCs w:val="18"/>
-        </w:rPr>
-      </w:pPr>
-      <w:r>
-        <w:rPr>
-          <w:b/>
-          <w:bCs/>
-          <w:sz w:val="22"/>
-          <w:szCs w:val="22"/>
-          <w:highlight w:val="none"/>
-          <w:lang w:val="ru-RU" w:bidi="ru-RU"/>
-        </w:rPr>
-      </w:r>
-      <w:r>
-        <w:rPr>
-          <w:b/>
-          <w:bCs/>
-          <w:sz w:val="22"/>
-          <w:szCs w:val="22"/>
-          <w:highlight w:val="none"/>
-          <w:lang w:val="ru-RU" w:bidi="ru-RU"/>
-        </w:rPr>
-      </w:r>
-      <w:r>
-        <w:rPr>
-          <w:b/>
-          <w:bCs/>
-          <w:sz w:val="22"/>
-          <w:szCs w:val="22"/>
-          <w:highlight w:val="none"/>
-          <w:lang w:val="ru-RU" w:bidi="ru-RU"/>
-        </w:rPr>
-      </w:r>
-    </w:p>
-    <w:p>
-      <w:pPr>
         <w:pStyle w:val="827"/>
         <w:pBdr/>
         <w:spacing/>
@@ -3701,6 +4323,13 @@
         <w:rPr>
           <w:highlight w:val="none"/>
           <w:lang w:val="ru-RU"/>
+        </w:rPr>
+      </w:r>
+      <w:r>
+        <w:rPr>
+          <w:highlight w:val="none"/>
+          <w:lang w:val="ru-RU" w:bidi="ru-RU"/>
+          <w14:ligatures w14:val="none"/>
         </w:rPr>
       </w:r>
     </w:p>
@@ -3725,17 +4354,6 @@
           <w:bCs w:val="0"/>
           <w:sz w:val="24"/>
           <w:szCs w:val="24"/>
-          <w:highlight w:val="none"/>
-          <w:lang w:val="ru-RU" w:bidi="ru-RU"/>
-        </w:rPr>
-      </w:r>
-      <w:r>
-        <w:rPr>
-          <w:rFonts w:ascii="Times New Roman" w:hAnsi="Times New Roman" w:cs="Times New Roman"/>
-          <w:b/>
-          <w:bCs/>
-          <w:sz w:val="28"/>
-          <w:szCs w:val="28"/>
           <w:highlight w:val="none"/>
           <w:lang w:val="ru-RU" w:bidi="ru-RU"/>
         </w:rPr>
@@ -3812,12 +4430,11 @@
       <w:r>
         <w:rPr>
           <w:rFonts w:ascii="Times New Roman" w:hAnsi="Times New Roman" w:cs="Times New Roman"/>
-          <w:b/>
-          <w:bCs/>
-          <w:sz w:val="28"/>
-          <w:szCs w:val="28"/>
-          <w:highlight w:val="none"/>
-          <w:lang w:val="ru-RU" w:bidi="ru-RU"/>
+          <w:b w:val="0"/>
+          <w:bCs w:val="0"/>
+          <w:sz w:val="24"/>
+          <w:szCs w:val="24"/>
+          <w:highlight w:val="none"/>
         </w:rPr>
       </w:r>
       <w:r>
@@ -3865,7 +4482,6 @@
           <w:sz w:val="28"/>
           <w:szCs w:val="28"/>
           <w:highlight w:val="none"/>
-          <w:lang w:val="ru-RU"/>
         </w:rPr>
       </w:r>
       <w:r>
@@ -4730,6 +5346,8 @@
         <w:rPr>
           <w:sz w:val="24"/>
           <w:szCs w:val="24"/>
+          <w:highlight w:val="none"/>
+          <w14:ligatures w14:val="none"/>
         </w:rPr>
       </w:r>
     </w:p>
@@ -4767,19 +5385,19 @@
         <w:rPr>
           <w:sz w:val="24"/>
           <w:szCs w:val="24"/>
-          <w:highlight w:val="none"/>
         </w:rPr>
       </w:r>
       <w:r>
         <w:rPr>
           <w:sz w:val="24"/>
           <w:szCs w:val="24"/>
+          <w14:ligatures w14:val="none"/>
         </w:rPr>
       </w:r>
     </w:p>
     <w:p>
       <w:pPr>
-        <w:pStyle w:val="1_709"/>
+        <w:pStyle w:val="892"/>
         <w:pBdr/>
         <w:spacing/>
         <w:ind/>
@@ -4796,12 +5414,17 @@
       <w:r>
         <w:rPr>
           <w:highlight w:val="none"/>
+        </w:rPr>
+      </w:r>
+      <w:r>
+        <w:rPr>
+          <w14:ligatures w14:val="none"/>
         </w:rPr>
       </w:r>
     </w:p>
     <w:p>
       <w:pPr>
-        <w:pStyle w:val="1_709"/>
+        <w:pStyle w:val="892"/>
         <w:pBdr/>
         <w:spacing/>
         <w:ind/>
@@ -4818,12 +5441,17 @@
       <w:r>
         <w:rPr>
           <w:highlight w:val="none"/>
+        </w:rPr>
+      </w:r>
+      <w:r>
+        <w:rPr>
+          <w14:ligatures w14:val="none"/>
         </w:rPr>
       </w:r>
     </w:p>
     <w:p>
       <w:pPr>
-        <w:pStyle w:val="1_709"/>
+        <w:pStyle w:val="892"/>
         <w:pBdr/>
         <w:spacing/>
         <w:ind/>
@@ -4840,12 +5468,17 @@
       <w:r>
         <w:rPr>
           <w:highlight w:val="none"/>
+        </w:rPr>
+      </w:r>
+      <w:r>
+        <w:rPr>
+          <w14:ligatures w14:val="none"/>
         </w:rPr>
       </w:r>
     </w:p>
     <w:p>
       <w:pPr>
-        <w:pStyle w:val="1_709"/>
+        <w:pStyle w:val="892"/>
         <w:pBdr/>
         <w:spacing/>
         <w:ind/>
@@ -4862,12 +5495,17 @@
       <w:r>
         <w:rPr>
           <w:highlight w:val="none"/>
+        </w:rPr>
+      </w:r>
+      <w:r>
+        <w:rPr>
+          <w14:ligatures w14:val="none"/>
         </w:rPr>
       </w:r>
     </w:p>
     <w:p>
       <w:pPr>
-        <w:pStyle w:val="1_709"/>
+        <w:pStyle w:val="892"/>
         <w:pBdr/>
         <w:spacing/>
         <w:ind/>
@@ -4884,12 +5522,17 @@
       <w:r>
         <w:rPr>
           <w:highlight w:val="none"/>
+        </w:rPr>
+      </w:r>
+      <w:r>
+        <w:rPr>
+          <w14:ligatures w14:val="none"/>
         </w:rPr>
       </w:r>
     </w:p>
     <w:p>
       <w:pPr>
-        <w:pStyle w:val="1_709"/>
+        <w:pStyle w:val="892"/>
         <w:pBdr/>
         <w:spacing/>
         <w:ind/>
@@ -4906,12 +5549,17 @@
       <w:r>
         <w:rPr>
           <w:highlight w:val="none"/>
+        </w:rPr>
+      </w:r>
+      <w:r>
+        <w:rPr>
+          <w14:ligatures w14:val="none"/>
         </w:rPr>
       </w:r>
     </w:p>
     <w:p>
       <w:pPr>
-        <w:pStyle w:val="1_709"/>
+        <w:pStyle w:val="892"/>
         <w:pBdr/>
         <w:spacing/>
         <w:ind/>
@@ -4928,12 +5576,17 @@
       <w:r>
         <w:rPr>
           <w:highlight w:val="none"/>
+        </w:rPr>
+      </w:r>
+      <w:r>
+        <w:rPr>
+          <w14:ligatures w14:val="none"/>
         </w:rPr>
       </w:r>
     </w:p>
     <w:p>
       <w:pPr>
-        <w:pStyle w:val="1_709"/>
+        <w:pStyle w:val="892"/>
         <w:pBdr/>
         <w:spacing/>
         <w:ind/>
@@ -4950,12 +5603,17 @@
       <w:r>
         <w:rPr>
           <w:highlight w:val="none"/>
+        </w:rPr>
+      </w:r>
+      <w:r>
+        <w:rPr>
+          <w14:ligatures w14:val="none"/>
         </w:rPr>
       </w:r>
     </w:p>
     <w:p>
       <w:pPr>
-        <w:pStyle w:val="1_709"/>
+        <w:pStyle w:val="892"/>
         <w:pBdr/>
         <w:spacing/>
         <w:ind/>
@@ -4971,12 +5629,17 @@
       <w:r>
         <w:rPr>
           <w:highlight w:val="none"/>
+        </w:rPr>
+      </w:r>
+      <w:r>
+        <w:rPr>
+          <w14:ligatures w14:val="none"/>
         </w:rPr>
       </w:r>
     </w:p>
     <w:p>
       <w:pPr>
-        <w:pStyle w:val="1_709"/>
+        <w:pStyle w:val="892"/>
         <w:pBdr/>
         <w:spacing/>
         <w:ind/>
@@ -4993,12 +5656,17 @@
       <w:r>
         <w:rPr>
           <w:highlight w:val="none"/>
+        </w:rPr>
+      </w:r>
+      <w:r>
+        <w:rPr>
+          <w14:ligatures w14:val="none"/>
         </w:rPr>
       </w:r>
     </w:p>
     <w:p>
       <w:pPr>
-        <w:pStyle w:val="1_709"/>
+        <w:pStyle w:val="892"/>
         <w:pBdr/>
         <w:spacing/>
         <w:ind/>
@@ -5015,12 +5683,17 @@
       <w:r>
         <w:rPr>
           <w:highlight w:val="none"/>
+        </w:rPr>
+      </w:r>
+      <w:r>
+        <w:rPr>
+          <w14:ligatures w14:val="none"/>
         </w:rPr>
       </w:r>
     </w:p>
     <w:p>
       <w:pPr>
-        <w:pStyle w:val="1_709"/>
+        <w:pStyle w:val="892"/>
         <w:pBdr/>
         <w:spacing/>
         <w:ind/>
@@ -5037,12 +5710,17 @@
       <w:r>
         <w:rPr>
           <w:highlight w:val="none"/>
+        </w:rPr>
+      </w:r>
+      <w:r>
+        <w:rPr>
+          <w14:ligatures w14:val="none"/>
         </w:rPr>
       </w:r>
     </w:p>
     <w:p>
       <w:pPr>
-        <w:pStyle w:val="1_709"/>
+        <w:pStyle w:val="892"/>
         <w:pBdr/>
         <w:spacing/>
         <w:ind/>
@@ -5059,12 +5737,17 @@
       <w:r>
         <w:rPr>
           <w:highlight w:val="none"/>
+        </w:rPr>
+      </w:r>
+      <w:r>
+        <w:rPr>
+          <w14:ligatures w14:val="none"/>
         </w:rPr>
       </w:r>
     </w:p>
     <w:p>
       <w:pPr>
-        <w:pStyle w:val="1_709"/>
+        <w:pStyle w:val="892"/>
         <w:pBdr/>
         <w:spacing/>
         <w:ind/>
@@ -5081,12 +5764,17 @@
       <w:r>
         <w:rPr>
           <w:highlight w:val="none"/>
+        </w:rPr>
+      </w:r>
+      <w:r>
+        <w:rPr>
+          <w14:ligatures w14:val="none"/>
         </w:rPr>
       </w:r>
     </w:p>
     <w:p>
       <w:pPr>
-        <w:pStyle w:val="1_709"/>
+        <w:pStyle w:val="892"/>
         <w:pBdr/>
         <w:spacing/>
         <w:ind/>
@@ -5103,12 +5791,17 @@
       <w:r>
         <w:rPr>
           <w:highlight w:val="none"/>
+        </w:rPr>
+      </w:r>
+      <w:r>
+        <w:rPr>
+          <w14:ligatures w14:val="none"/>
         </w:rPr>
       </w:r>
     </w:p>
     <w:p>
       <w:pPr>
-        <w:pStyle w:val="1_709"/>
+        <w:pStyle w:val="892"/>
         <w:pBdr/>
         <w:spacing/>
         <w:ind/>
@@ -5125,12 +5818,17 @@
       <w:r>
         <w:rPr>
           <w:highlight w:val="none"/>
+        </w:rPr>
+      </w:r>
+      <w:r>
+        <w:rPr>
+          <w14:ligatures w14:val="none"/>
         </w:rPr>
       </w:r>
     </w:p>
     <w:p>
       <w:pPr>
-        <w:pStyle w:val="1_709"/>
+        <w:pStyle w:val="892"/>
         <w:pBdr/>
         <w:spacing/>
         <w:ind/>
@@ -5147,12 +5845,17 @@
       <w:r>
         <w:rPr>
           <w:highlight w:val="none"/>
+        </w:rPr>
+      </w:r>
+      <w:r>
+        <w:rPr>
+          <w14:ligatures w14:val="none"/>
         </w:rPr>
       </w:r>
     </w:p>
     <w:p>
       <w:pPr>
-        <w:pStyle w:val="1_709"/>
+        <w:pStyle w:val="892"/>
         <w:pBdr/>
         <w:spacing/>
         <w:ind/>
@@ -5169,12 +5872,17 @@
       <w:r>
         <w:rPr>
           <w:highlight w:val="none"/>
+        </w:rPr>
+      </w:r>
+      <w:r>
+        <w:rPr>
+          <w14:ligatures w14:val="none"/>
         </w:rPr>
       </w:r>
     </w:p>
     <w:p>
       <w:pPr>
-        <w:pStyle w:val="1_709"/>
+        <w:pStyle w:val="892"/>
         <w:pBdr/>
         <w:spacing/>
         <w:ind/>
@@ -5191,12 +5899,17 @@
       <w:r>
         <w:rPr>
           <w:highlight w:val="none"/>
+        </w:rPr>
+      </w:r>
+      <w:r>
+        <w:rPr>
+          <w14:ligatures w14:val="none"/>
         </w:rPr>
       </w:r>
     </w:p>
     <w:p>
       <w:pPr>
-        <w:pStyle w:val="1_709"/>
+        <w:pStyle w:val="892"/>
         <w:pBdr/>
         <w:spacing/>
         <w:ind/>
@@ -5213,12 +5926,17 @@
       <w:r>
         <w:rPr>
           <w:highlight w:val="none"/>
+        </w:rPr>
+      </w:r>
+      <w:r>
+        <w:rPr>
+          <w14:ligatures w14:val="none"/>
         </w:rPr>
       </w:r>
     </w:p>
     <w:p>
       <w:pPr>
-        <w:pStyle w:val="1_709"/>
+        <w:pStyle w:val="892"/>
         <w:pBdr/>
         <w:spacing/>
         <w:ind/>
@@ -5235,12 +5953,17 @@
       <w:r>
         <w:rPr>
           <w:highlight w:val="none"/>
+        </w:rPr>
+      </w:r>
+      <w:r>
+        <w:rPr>
+          <w14:ligatures w14:val="none"/>
         </w:rPr>
       </w:r>
     </w:p>
     <w:p>
       <w:pPr>
-        <w:pStyle w:val="1_709"/>
+        <w:pStyle w:val="892"/>
         <w:pBdr/>
         <w:spacing/>
         <w:ind/>
@@ -5257,12 +5980,17 @@
       <w:r>
         <w:rPr>
           <w:highlight w:val="none"/>
+        </w:rPr>
+      </w:r>
+      <w:r>
+        <w:rPr>
+          <w14:ligatures w14:val="none"/>
         </w:rPr>
       </w:r>
     </w:p>
     <w:p>
       <w:pPr>
-        <w:pStyle w:val="1_709"/>
+        <w:pStyle w:val="892"/>
         <w:pBdr/>
         <w:spacing/>
         <w:ind/>
@@ -5279,12 +6007,17 @@
       <w:r>
         <w:rPr>
           <w:highlight w:val="none"/>
+        </w:rPr>
+      </w:r>
+      <w:r>
+        <w:rPr>
+          <w14:ligatures w14:val="none"/>
         </w:rPr>
       </w:r>
     </w:p>
     <w:p>
       <w:pPr>
-        <w:pStyle w:val="1_709"/>
+        <w:pStyle w:val="892"/>
         <w:pBdr/>
         <w:spacing/>
         <w:ind/>
@@ -5300,12 +6033,17 @@
       <w:r>
         <w:rPr>
           <w:highlight w:val="none"/>
+        </w:rPr>
+      </w:r>
+      <w:r>
+        <w:rPr>
+          <w14:ligatures w14:val="none"/>
         </w:rPr>
       </w:r>
     </w:p>
     <w:p>
       <w:pPr>
-        <w:pStyle w:val="1_709"/>
+        <w:pStyle w:val="892"/>
         <w:pBdr/>
         <w:spacing/>
         <w:ind/>
@@ -5322,12 +6060,17 @@
       <w:r>
         <w:rPr>
           <w:highlight w:val="none"/>
+        </w:rPr>
+      </w:r>
+      <w:r>
+        <w:rPr>
+          <w14:ligatures w14:val="none"/>
         </w:rPr>
       </w:r>
     </w:p>
     <w:p>
       <w:pPr>
-        <w:pStyle w:val="1_709"/>
+        <w:pStyle w:val="892"/>
         <w:pBdr/>
         <w:spacing/>
         <w:ind/>
@@ -5344,12 +6087,17 @@
       <w:r>
         <w:rPr>
           <w:highlight w:val="none"/>
+        </w:rPr>
+      </w:r>
+      <w:r>
+        <w:rPr>
+          <w14:ligatures w14:val="none"/>
         </w:rPr>
       </w:r>
     </w:p>
     <w:p>
       <w:pPr>
-        <w:pStyle w:val="1_709"/>
+        <w:pStyle w:val="892"/>
         <w:pBdr/>
         <w:spacing/>
         <w:ind/>
@@ -5366,12 +6114,17 @@
       <w:r>
         <w:rPr>
           <w:highlight w:val="none"/>
+        </w:rPr>
+      </w:r>
+      <w:r>
+        <w:rPr>
+          <w14:ligatures w14:val="none"/>
         </w:rPr>
       </w:r>
     </w:p>
     <w:p>
       <w:pPr>
-        <w:pStyle w:val="1_709"/>
+        <w:pStyle w:val="892"/>
         <w:pBdr/>
         <w:spacing/>
         <w:ind/>
@@ -5388,12 +6141,17 @@
       <w:r>
         <w:rPr>
           <w:highlight w:val="none"/>
+        </w:rPr>
+      </w:r>
+      <w:r>
+        <w:rPr>
+          <w14:ligatures w14:val="none"/>
         </w:rPr>
       </w:r>
     </w:p>
     <w:p>
       <w:pPr>
-        <w:pStyle w:val="1_709"/>
+        <w:pStyle w:val="892"/>
         <w:pBdr/>
         <w:spacing/>
         <w:ind/>
@@ -5410,12 +6168,17 @@
       <w:r>
         <w:rPr>
           <w:highlight w:val="none"/>
+        </w:rPr>
+      </w:r>
+      <w:r>
+        <w:rPr>
+          <w14:ligatures w14:val="none"/>
         </w:rPr>
       </w:r>
     </w:p>
     <w:p>
       <w:pPr>
-        <w:pStyle w:val="1_709"/>
+        <w:pStyle w:val="892"/>
         <w:pBdr/>
         <w:spacing/>
         <w:ind/>
@@ -5432,12 +6195,17 @@
       <w:r>
         <w:rPr>
           <w:highlight w:val="none"/>
+        </w:rPr>
+      </w:r>
+      <w:r>
+        <w:rPr>
+          <w14:ligatures w14:val="none"/>
         </w:rPr>
       </w:r>
     </w:p>
     <w:p>
       <w:pPr>
-        <w:pStyle w:val="1_709"/>
+        <w:pStyle w:val="892"/>
         <w:pBdr/>
         <w:spacing/>
         <w:ind/>
@@ -5454,12 +6222,17 @@
       <w:r>
         <w:rPr>
           <w:highlight w:val="none"/>
+        </w:rPr>
+      </w:r>
+      <w:r>
+        <w:rPr>
+          <w14:ligatures w14:val="none"/>
         </w:rPr>
       </w:r>
     </w:p>
     <w:p>
       <w:pPr>
-        <w:pStyle w:val="1_709"/>
+        <w:pStyle w:val="892"/>
         <w:pBdr/>
         <w:spacing/>
         <w:ind/>
@@ -5475,12 +6248,17 @@
       <w:r>
         <w:rPr>
           <w:highlight w:val="none"/>
+        </w:rPr>
+      </w:r>
+      <w:r>
+        <w:rPr>
+          <w14:ligatures w14:val="none"/>
         </w:rPr>
       </w:r>
     </w:p>
     <w:p>
       <w:pPr>
-        <w:pStyle w:val="1_709"/>
+        <w:pStyle w:val="892"/>
         <w:pBdr/>
         <w:spacing/>
         <w:ind/>
@@ -5497,12 +6275,17 @@
       <w:r>
         <w:rPr>
           <w:highlight w:val="none"/>
+        </w:rPr>
+      </w:r>
+      <w:r>
+        <w:rPr>
+          <w14:ligatures w14:val="none"/>
         </w:rPr>
       </w:r>
     </w:p>
     <w:p>
       <w:pPr>
-        <w:pStyle w:val="1_709"/>
+        <w:pStyle w:val="892"/>
         <w:pBdr/>
         <w:spacing/>
         <w:ind/>
@@ -5519,12 +6302,17 @@
       <w:r>
         <w:rPr>
           <w:highlight w:val="none"/>
+        </w:rPr>
+      </w:r>
+      <w:r>
+        <w:rPr>
+          <w14:ligatures w14:val="none"/>
         </w:rPr>
       </w:r>
     </w:p>
     <w:p>
       <w:pPr>
-        <w:pStyle w:val="1_709"/>
+        <w:pStyle w:val="892"/>
         <w:pBdr/>
         <w:spacing/>
         <w:ind/>
@@ -5541,12 +6329,17 @@
       <w:r>
         <w:rPr>
           <w:highlight w:val="none"/>
+        </w:rPr>
+      </w:r>
+      <w:r>
+        <w:rPr>
+          <w14:ligatures w14:val="none"/>
         </w:rPr>
       </w:r>
     </w:p>
     <w:p>
       <w:pPr>
-        <w:pStyle w:val="1_709"/>
+        <w:pStyle w:val="892"/>
         <w:pBdr/>
         <w:spacing/>
         <w:ind/>
@@ -5563,12 +6356,17 @@
       <w:r>
         <w:rPr>
           <w:highlight w:val="none"/>
+        </w:rPr>
+      </w:r>
+      <w:r>
+        <w:rPr>
+          <w14:ligatures w14:val="none"/>
         </w:rPr>
       </w:r>
     </w:p>
     <w:p>
       <w:pPr>
-        <w:pStyle w:val="1_709"/>
+        <w:pStyle w:val="892"/>
         <w:pBdr/>
         <w:spacing/>
         <w:ind/>
@@ -5585,12 +6383,17 @@
       <w:r>
         <w:rPr>
           <w:highlight w:val="none"/>
+        </w:rPr>
+      </w:r>
+      <w:r>
+        <w:rPr>
+          <w14:ligatures w14:val="none"/>
         </w:rPr>
       </w:r>
     </w:p>
     <w:p>
       <w:pPr>
-        <w:pStyle w:val="1_709"/>
+        <w:pStyle w:val="892"/>
         <w:pBdr/>
         <w:spacing/>
         <w:ind/>
@@ -5607,12 +6410,17 @@
       <w:r>
         <w:rPr>
           <w:highlight w:val="none"/>
+        </w:rPr>
+      </w:r>
+      <w:r>
+        <w:rPr>
+          <w14:ligatures w14:val="none"/>
         </w:rPr>
       </w:r>
     </w:p>
     <w:p>
       <w:pPr>
-        <w:pStyle w:val="1_709"/>
+        <w:pStyle w:val="892"/>
         <w:pBdr/>
         <w:spacing/>
         <w:ind/>
@@ -5629,12 +6437,17 @@
       <w:r>
         <w:rPr>
           <w:highlight w:val="none"/>
+        </w:rPr>
+      </w:r>
+      <w:r>
+        <w:rPr>
+          <w14:ligatures w14:val="none"/>
         </w:rPr>
       </w:r>
     </w:p>
     <w:p>
       <w:pPr>
-        <w:pStyle w:val="1_709"/>
+        <w:pStyle w:val="892"/>
         <w:pBdr/>
         <w:spacing/>
         <w:ind/>
@@ -5650,12 +6463,17 @@
       <w:r>
         <w:rPr>
           <w:highlight w:val="none"/>
+        </w:rPr>
+      </w:r>
+      <w:r>
+        <w:rPr>
+          <w14:ligatures w14:val="none"/>
         </w:rPr>
       </w:r>
     </w:p>
     <w:p>
       <w:pPr>
-        <w:pStyle w:val="1_709"/>
+        <w:pStyle w:val="892"/>
         <w:pBdr/>
         <w:spacing/>
         <w:ind/>
@@ -5672,13 +6490,18 @@
       <w:r>
         <w:rPr>
           <w:highlight w:val="none"/>
+        </w:rPr>
+      </w:r>
+      <w:r>
+        <w:rPr>
+          <w14:ligatures w14:val="none"/>
         </w:rPr>
       </w:r>
     </w:p>
     <w:p>
       <w:pPr>
         <w:pBdr/>
-        <w:shd w:val="nil"/>
+        <w:shd w:val="nil" w:color="auto"/>
         <w:spacing/>
         <w:ind/>
         <w:rPr>
@@ -5700,12 +6523,13 @@
       <w:r>
         <w:rPr>
           <w:highlight w:val="none"/>
+          <w14:ligatures w14:val="none"/>
         </w:rPr>
       </w:r>
     </w:p>
     <w:p>
       <w:pPr>
-        <w:pStyle w:val="1_709"/>
+        <w:pStyle w:val="892"/>
         <w:pBdr/>
         <w:spacing/>
         <w:ind/>
@@ -5723,12 +6547,18 @@
       <w:r>
         <w:rPr>
           <w:highlight w:val="none"/>
+        </w:rPr>
+      </w:r>
+      <w:r>
+        <w:rPr>
+          <w:highlight w:val="none"/>
+          <w14:ligatures w14:val="none"/>
         </w:rPr>
       </w:r>
     </w:p>
     <w:p>
       <w:pPr>
-        <w:pStyle w:val="1_709"/>
+        <w:pStyle w:val="892"/>
         <w:pBdr/>
         <w:spacing/>
         <w:ind/>
@@ -5745,12 +6575,17 @@
       <w:r>
         <w:rPr>
           <w:highlight w:val="none"/>
+        </w:rPr>
+      </w:r>
+      <w:r>
+        <w:rPr>
+          <w14:ligatures w14:val="none"/>
         </w:rPr>
       </w:r>
     </w:p>
     <w:p>
       <w:pPr>
-        <w:pStyle w:val="1_709"/>
+        <w:pStyle w:val="892"/>
         <w:pBdr/>
         <w:spacing/>
         <w:ind/>
@@ -5767,12 +6602,17 @@
       <w:r>
         <w:rPr>
           <w:highlight w:val="none"/>
+        </w:rPr>
+      </w:r>
+      <w:r>
+        <w:rPr>
+          <w14:ligatures w14:val="none"/>
         </w:rPr>
       </w:r>
     </w:p>
     <w:p>
       <w:pPr>
-        <w:pStyle w:val="1_709"/>
+        <w:pStyle w:val="892"/>
         <w:pBdr/>
         <w:spacing/>
         <w:ind/>
@@ -5789,12 +6629,17 @@
       <w:r>
         <w:rPr>
           <w:highlight w:val="none"/>
+        </w:rPr>
+      </w:r>
+      <w:r>
+        <w:rPr>
+          <w14:ligatures w14:val="none"/>
         </w:rPr>
       </w:r>
     </w:p>
     <w:p>
       <w:pPr>
-        <w:pStyle w:val="1_709"/>
+        <w:pStyle w:val="892"/>
         <w:pBdr/>
         <w:spacing/>
         <w:ind/>
@@ -5811,12 +6656,17 @@
       <w:r>
         <w:rPr>
           <w:highlight w:val="none"/>
+        </w:rPr>
+      </w:r>
+      <w:r>
+        <w:rPr>
+          <w14:ligatures w14:val="none"/>
         </w:rPr>
       </w:r>
     </w:p>
     <w:p>
       <w:pPr>
-        <w:pStyle w:val="1_709"/>
+        <w:pStyle w:val="892"/>
         <w:pBdr/>
         <w:spacing/>
         <w:ind/>
@@ -5833,12 +6683,17 @@
       <w:r>
         <w:rPr>
           <w:highlight w:val="none"/>
+        </w:rPr>
+      </w:r>
+      <w:r>
+        <w:rPr>
+          <w14:ligatures w14:val="none"/>
         </w:rPr>
       </w:r>
     </w:p>
     <w:p>
       <w:pPr>
-        <w:pStyle w:val="1_709"/>
+        <w:pStyle w:val="892"/>
         <w:pBdr/>
         <w:spacing/>
         <w:ind/>
@@ -5854,12 +6709,17 @@
       <w:r>
         <w:rPr>
           <w:highlight w:val="none"/>
+        </w:rPr>
+      </w:r>
+      <w:r>
+        <w:rPr>
+          <w14:ligatures w14:val="none"/>
         </w:rPr>
       </w:r>
     </w:p>
     <w:p>
       <w:pPr>
-        <w:pStyle w:val="1_709"/>
+        <w:pStyle w:val="892"/>
         <w:pBdr/>
         <w:spacing/>
         <w:ind/>
@@ -5876,12 +6736,17 @@
       <w:r>
         <w:rPr>
           <w:highlight w:val="none"/>
+        </w:rPr>
+      </w:r>
+      <w:r>
+        <w:rPr>
+          <w14:ligatures w14:val="none"/>
         </w:rPr>
       </w:r>
     </w:p>
     <w:p>
       <w:pPr>
-        <w:pStyle w:val="1_709"/>
+        <w:pStyle w:val="892"/>
         <w:pBdr/>
         <w:spacing/>
         <w:ind/>
@@ -5898,12 +6763,17 @@
       <w:r>
         <w:rPr>
           <w:highlight w:val="none"/>
+        </w:rPr>
+      </w:r>
+      <w:r>
+        <w:rPr>
+          <w14:ligatures w14:val="none"/>
         </w:rPr>
       </w:r>
     </w:p>
     <w:p>
       <w:pPr>
-        <w:pStyle w:val="1_709"/>
+        <w:pStyle w:val="892"/>
         <w:pBdr/>
         <w:spacing/>
         <w:ind/>
@@ -5920,12 +6790,17 @@
       <w:r>
         <w:rPr>
           <w:highlight w:val="none"/>
+        </w:rPr>
+      </w:r>
+      <w:r>
+        <w:rPr>
+          <w14:ligatures w14:val="none"/>
         </w:rPr>
       </w:r>
     </w:p>
     <w:p>
       <w:pPr>
-        <w:pStyle w:val="1_709"/>
+        <w:pStyle w:val="892"/>
         <w:pBdr/>
         <w:spacing/>
         <w:ind/>
@@ -5942,12 +6817,17 @@
       <w:r>
         <w:rPr>
           <w:highlight w:val="none"/>
+        </w:rPr>
+      </w:r>
+      <w:r>
+        <w:rPr>
+          <w14:ligatures w14:val="none"/>
         </w:rPr>
       </w:r>
     </w:p>
     <w:p>
       <w:pPr>
-        <w:pStyle w:val="1_709"/>
+        <w:pStyle w:val="892"/>
         <w:pBdr/>
         <w:spacing/>
         <w:ind/>
@@ -5964,12 +6844,17 @@
       <w:r>
         <w:rPr>
           <w:highlight w:val="none"/>
+        </w:rPr>
+      </w:r>
+      <w:r>
+        <w:rPr>
+          <w14:ligatures w14:val="none"/>
         </w:rPr>
       </w:r>
     </w:p>
     <w:p>
       <w:pPr>
-        <w:pStyle w:val="1_709"/>
+        <w:pStyle w:val="892"/>
         <w:pBdr/>
         <w:spacing/>
         <w:ind/>
@@ -5986,12 +6871,17 @@
       <w:r>
         <w:rPr>
           <w:highlight w:val="none"/>
+        </w:rPr>
+      </w:r>
+      <w:r>
+        <w:rPr>
+          <w14:ligatures w14:val="none"/>
         </w:rPr>
       </w:r>
     </w:p>
     <w:p>
       <w:pPr>
-        <w:pStyle w:val="1_709"/>
+        <w:pStyle w:val="892"/>
         <w:pBdr/>
         <w:spacing/>
         <w:ind/>
@@ -6008,12 +6898,17 @@
       <w:r>
         <w:rPr>
           <w:highlight w:val="none"/>
+        </w:rPr>
+      </w:r>
+      <w:r>
+        <w:rPr>
+          <w14:ligatures w14:val="none"/>
         </w:rPr>
       </w:r>
     </w:p>
     <w:p>
       <w:pPr>
-        <w:pStyle w:val="1_709"/>
+        <w:pStyle w:val="892"/>
         <w:pBdr/>
         <w:spacing/>
         <w:ind/>
@@ -6029,12 +6924,17 @@
       <w:r>
         <w:rPr>
           <w:highlight w:val="none"/>
+        </w:rPr>
+      </w:r>
+      <w:r>
+        <w:rPr>
+          <w14:ligatures w14:val="none"/>
         </w:rPr>
       </w:r>
     </w:p>
     <w:p>
       <w:pPr>
-        <w:pStyle w:val="1_709"/>
+        <w:pStyle w:val="892"/>
         <w:pBdr/>
         <w:spacing/>
         <w:ind/>
@@ -6051,12 +6951,17 @@
       <w:r>
         <w:rPr>
           <w:highlight w:val="none"/>
+        </w:rPr>
+      </w:r>
+      <w:r>
+        <w:rPr>
+          <w14:ligatures w14:val="none"/>
         </w:rPr>
       </w:r>
     </w:p>
     <w:p>
       <w:pPr>
-        <w:pStyle w:val="1_709"/>
+        <w:pStyle w:val="892"/>
         <w:pBdr/>
         <w:spacing/>
         <w:ind/>
@@ -6072,12 +6977,17 @@
       <w:r>
         <w:rPr>
           <w:highlight w:val="none"/>
+        </w:rPr>
+      </w:r>
+      <w:r>
+        <w:rPr>
+          <w14:ligatures w14:val="none"/>
         </w:rPr>
       </w:r>
     </w:p>
     <w:p>
       <w:pPr>
-        <w:pStyle w:val="1_709"/>
+        <w:pStyle w:val="892"/>
         <w:pBdr/>
         <w:spacing/>
         <w:ind/>
@@ -6094,12 +7004,17 @@
       <w:r>
         <w:rPr>
           <w:highlight w:val="none"/>
+        </w:rPr>
+      </w:r>
+      <w:r>
+        <w:rPr>
+          <w14:ligatures w14:val="none"/>
         </w:rPr>
       </w:r>
     </w:p>
     <w:p>
       <w:pPr>
-        <w:pStyle w:val="1_709"/>
+        <w:pStyle w:val="892"/>
         <w:pBdr/>
         <w:spacing/>
         <w:ind/>
@@ -6116,12 +7031,17 @@
       <w:r>
         <w:rPr>
           <w:highlight w:val="none"/>
+        </w:rPr>
+      </w:r>
+      <w:r>
+        <w:rPr>
+          <w14:ligatures w14:val="none"/>
         </w:rPr>
       </w:r>
     </w:p>
     <w:p>
       <w:pPr>
-        <w:pStyle w:val="1_709"/>
+        <w:pStyle w:val="892"/>
         <w:pBdr/>
         <w:spacing/>
         <w:ind/>
@@ -6138,12 +7058,17 @@
       <w:r>
         <w:rPr>
           <w:highlight w:val="none"/>
+        </w:rPr>
+      </w:r>
+      <w:r>
+        <w:rPr>
+          <w14:ligatures w14:val="none"/>
         </w:rPr>
       </w:r>
     </w:p>
     <w:p>
       <w:pPr>
-        <w:pStyle w:val="1_709"/>
+        <w:pStyle w:val="892"/>
         <w:pBdr/>
         <w:spacing/>
         <w:ind/>
@@ -6159,12 +7084,17 @@
       <w:r>
         <w:rPr>
           <w:highlight w:val="none"/>
+        </w:rPr>
+      </w:r>
+      <w:r>
+        <w:rPr>
+          <w14:ligatures w14:val="none"/>
         </w:rPr>
       </w:r>
     </w:p>
     <w:p>
       <w:pPr>
-        <w:pStyle w:val="1_709"/>
+        <w:pStyle w:val="892"/>
         <w:pBdr/>
         <w:spacing/>
         <w:ind/>
@@ -6181,12 +7111,17 @@
       <w:r>
         <w:rPr>
           <w:highlight w:val="none"/>
+        </w:rPr>
+      </w:r>
+      <w:r>
+        <w:rPr>
+          <w14:ligatures w14:val="none"/>
         </w:rPr>
       </w:r>
     </w:p>
     <w:p>
       <w:pPr>
-        <w:pStyle w:val="1_709"/>
+        <w:pStyle w:val="892"/>
         <w:pBdr/>
         <w:spacing/>
         <w:ind/>
@@ -6203,12 +7138,17 @@
       <w:r>
         <w:rPr>
           <w:highlight w:val="none"/>
+        </w:rPr>
+      </w:r>
+      <w:r>
+        <w:rPr>
+          <w14:ligatures w14:val="none"/>
         </w:rPr>
       </w:r>
     </w:p>
     <w:p>
       <w:pPr>
-        <w:pStyle w:val="1_709"/>
+        <w:pStyle w:val="892"/>
         <w:pBdr/>
         <w:spacing/>
         <w:ind/>
@@ -6225,12 +7165,17 @@
       <w:r>
         <w:rPr>
           <w:highlight w:val="none"/>
+        </w:rPr>
+      </w:r>
+      <w:r>
+        <w:rPr>
+          <w14:ligatures w14:val="none"/>
         </w:rPr>
       </w:r>
     </w:p>
     <w:p>
       <w:pPr>
-        <w:pStyle w:val="1_709"/>
+        <w:pStyle w:val="892"/>
         <w:pBdr/>
         <w:spacing/>
         <w:ind/>
@@ -6247,12 +7192,17 @@
       <w:r>
         <w:rPr>
           <w:highlight w:val="none"/>
+        </w:rPr>
+      </w:r>
+      <w:r>
+        <w:rPr>
+          <w14:ligatures w14:val="none"/>
         </w:rPr>
       </w:r>
     </w:p>
     <w:p>
       <w:pPr>
-        <w:pStyle w:val="1_709"/>
+        <w:pStyle w:val="892"/>
         <w:pBdr/>
         <w:spacing/>
         <w:ind/>
@@ -6269,12 +7219,17 @@
       <w:r>
         <w:rPr>
           <w:highlight w:val="none"/>
+        </w:rPr>
+      </w:r>
+      <w:r>
+        <w:rPr>
+          <w14:ligatures w14:val="none"/>
         </w:rPr>
       </w:r>
     </w:p>
     <w:p>
       <w:pPr>
-        <w:pStyle w:val="1_709"/>
+        <w:pStyle w:val="892"/>
         <w:pBdr/>
         <w:spacing/>
         <w:ind/>
@@ -6291,12 +7246,17 @@
       <w:r>
         <w:rPr>
           <w:highlight w:val="none"/>
+        </w:rPr>
+      </w:r>
+      <w:r>
+        <w:rPr>
+          <w14:ligatures w14:val="none"/>
         </w:rPr>
       </w:r>
     </w:p>
     <w:p>
       <w:pPr>
-        <w:pStyle w:val="1_709"/>
+        <w:pStyle w:val="892"/>
         <w:pBdr/>
         <w:spacing/>
         <w:ind/>
@@ -6313,12 +7273,17 @@
       <w:r>
         <w:rPr>
           <w:highlight w:val="none"/>
+        </w:rPr>
+      </w:r>
+      <w:r>
+        <w:rPr>
+          <w14:ligatures w14:val="none"/>
         </w:rPr>
       </w:r>
     </w:p>
     <w:p>
       <w:pPr>
-        <w:pStyle w:val="1_709"/>
+        <w:pStyle w:val="892"/>
         <w:pBdr/>
         <w:spacing/>
         <w:ind/>
@@ -6335,12 +7300,17 @@
       <w:r>
         <w:rPr>
           <w:highlight w:val="none"/>
+        </w:rPr>
+      </w:r>
+      <w:r>
+        <w:rPr>
+          <w14:ligatures w14:val="none"/>
         </w:rPr>
       </w:r>
     </w:p>
     <w:p>
       <w:pPr>
-        <w:pStyle w:val="1_709"/>
+        <w:pStyle w:val="892"/>
         <w:pBdr/>
         <w:spacing/>
         <w:ind/>
@@ -6357,12 +7327,17 @@
       <w:r>
         <w:rPr>
           <w:highlight w:val="none"/>
+        </w:rPr>
+      </w:r>
+      <w:r>
+        <w:rPr>
+          <w14:ligatures w14:val="none"/>
         </w:rPr>
       </w:r>
     </w:p>
     <w:p>
       <w:pPr>
-        <w:pStyle w:val="1_709"/>
+        <w:pStyle w:val="892"/>
         <w:pBdr/>
         <w:spacing/>
         <w:ind/>
@@ -6379,12 +7354,17 @@
       <w:r>
         <w:rPr>
           <w:highlight w:val="none"/>
+        </w:rPr>
+      </w:r>
+      <w:r>
+        <w:rPr>
+          <w14:ligatures w14:val="none"/>
         </w:rPr>
       </w:r>
     </w:p>
     <w:p>
       <w:pPr>
-        <w:pStyle w:val="1_709"/>
+        <w:pStyle w:val="892"/>
         <w:pBdr/>
         <w:spacing/>
         <w:ind/>
@@ -6401,12 +7381,17 @@
       <w:r>
         <w:rPr>
           <w:highlight w:val="none"/>
+        </w:rPr>
+      </w:r>
+      <w:r>
+        <w:rPr>
+          <w14:ligatures w14:val="none"/>
         </w:rPr>
       </w:r>
     </w:p>
     <w:p>
       <w:pPr>
-        <w:pStyle w:val="1_709"/>
+        <w:pStyle w:val="892"/>
         <w:pBdr/>
         <w:spacing/>
         <w:ind/>
@@ -6423,12 +7408,17 @@
       <w:r>
         <w:rPr>
           <w:highlight w:val="none"/>
+        </w:rPr>
+      </w:r>
+      <w:r>
+        <w:rPr>
+          <w14:ligatures w14:val="none"/>
         </w:rPr>
       </w:r>
     </w:p>
     <w:p>
       <w:pPr>
-        <w:pStyle w:val="1_709"/>
+        <w:pStyle w:val="892"/>
         <w:pBdr/>
         <w:spacing/>
         <w:ind/>
@@ -6445,12 +7435,17 @@
       <w:r>
         <w:rPr>
           <w:highlight w:val="none"/>
+        </w:rPr>
+      </w:r>
+      <w:r>
+        <w:rPr>
+          <w14:ligatures w14:val="none"/>
         </w:rPr>
       </w:r>
     </w:p>
     <w:p>
       <w:pPr>
-        <w:pStyle w:val="1_709"/>
+        <w:pStyle w:val="892"/>
         <w:pBdr/>
         <w:spacing/>
         <w:ind/>
@@ -6467,12 +7462,17 @@
       <w:r>
         <w:rPr>
           <w:highlight w:val="none"/>
+        </w:rPr>
+      </w:r>
+      <w:r>
+        <w:rPr>
+          <w14:ligatures w14:val="none"/>
         </w:rPr>
       </w:r>
     </w:p>
     <w:p>
       <w:pPr>
-        <w:pStyle w:val="1_709"/>
+        <w:pStyle w:val="892"/>
         <w:pBdr/>
         <w:spacing/>
         <w:ind/>
@@ -6488,12 +7488,17 @@
       <w:r>
         <w:rPr>
           <w:highlight w:val="none"/>
+        </w:rPr>
+      </w:r>
+      <w:r>
+        <w:rPr>
+          <w14:ligatures w14:val="none"/>
         </w:rPr>
       </w:r>
     </w:p>
     <w:p>
       <w:pPr>
-        <w:pStyle w:val="1_709"/>
+        <w:pStyle w:val="892"/>
         <w:pBdr/>
         <w:spacing/>
         <w:ind/>
@@ -6510,12 +7515,17 @@
       <w:r>
         <w:rPr>
           <w:highlight w:val="none"/>
+        </w:rPr>
+      </w:r>
+      <w:r>
+        <w:rPr>
+          <w14:ligatures w14:val="none"/>
         </w:rPr>
       </w:r>
     </w:p>
     <w:p>
       <w:pPr>
-        <w:pStyle w:val="1_709"/>
+        <w:pStyle w:val="892"/>
         <w:pBdr/>
         <w:spacing/>
         <w:ind/>
@@ -6532,12 +7542,17 @@
       <w:r>
         <w:rPr>
           <w:highlight w:val="none"/>
+        </w:rPr>
+      </w:r>
+      <w:r>
+        <w:rPr>
+          <w14:ligatures w14:val="none"/>
         </w:rPr>
       </w:r>
     </w:p>
     <w:p>
       <w:pPr>
-        <w:pStyle w:val="1_709"/>
+        <w:pStyle w:val="892"/>
         <w:pBdr/>
         <w:spacing/>
         <w:ind/>
@@ -6554,12 +7569,17 @@
       <w:r>
         <w:rPr>
           <w:highlight w:val="none"/>
+        </w:rPr>
+      </w:r>
+      <w:r>
+        <w:rPr>
+          <w14:ligatures w14:val="none"/>
         </w:rPr>
       </w:r>
     </w:p>
     <w:p>
       <w:pPr>
-        <w:pStyle w:val="1_709"/>
+        <w:pStyle w:val="892"/>
         <w:pBdr/>
         <w:spacing/>
         <w:ind/>
@@ -6576,12 +7596,17 @@
       <w:r>
         <w:rPr>
           <w:highlight w:val="none"/>
+        </w:rPr>
+      </w:r>
+      <w:r>
+        <w:rPr>
+          <w14:ligatures w14:val="none"/>
         </w:rPr>
       </w:r>
     </w:p>
     <w:p>
       <w:pPr>
-        <w:pStyle w:val="1_709"/>
+        <w:pStyle w:val="892"/>
         <w:pBdr/>
         <w:spacing/>
         <w:ind/>
@@ -6598,12 +7623,17 @@
       <w:r>
         <w:rPr>
           <w:highlight w:val="none"/>
+        </w:rPr>
+      </w:r>
+      <w:r>
+        <w:rPr>
+          <w14:ligatures w14:val="none"/>
         </w:rPr>
       </w:r>
     </w:p>
     <w:p>
       <w:pPr>
-        <w:pStyle w:val="1_709"/>
+        <w:pStyle w:val="892"/>
         <w:pBdr/>
         <w:spacing/>
         <w:ind/>
@@ -6620,12 +7650,17 @@
       <w:r>
         <w:rPr>
           <w:highlight w:val="none"/>
+        </w:rPr>
+      </w:r>
+      <w:r>
+        <w:rPr>
+          <w14:ligatures w14:val="none"/>
         </w:rPr>
       </w:r>
     </w:p>
     <w:p>
       <w:pPr>
-        <w:pStyle w:val="1_709"/>
+        <w:pStyle w:val="892"/>
         <w:pBdr/>
         <w:spacing/>
         <w:ind/>
@@ -6642,12 +7677,17 @@
       <w:r>
         <w:rPr>
           <w:highlight w:val="none"/>
+        </w:rPr>
+      </w:r>
+      <w:r>
+        <w:rPr>
+          <w14:ligatures w14:val="none"/>
         </w:rPr>
       </w:r>
     </w:p>
     <w:p>
       <w:pPr>
-        <w:pStyle w:val="1_709"/>
+        <w:pStyle w:val="892"/>
         <w:pBdr/>
         <w:spacing/>
         <w:ind/>
@@ -6663,13 +7703,18 @@
       <w:r>
         <w:rPr>
           <w:highlight w:val="none"/>
+        </w:rPr>
+      </w:r>
+      <w:r>
+        <w:rPr>
+          <w14:ligatures w14:val="none"/>
         </w:rPr>
       </w:r>
     </w:p>
     <w:p>
       <w:pPr>
         <w:pBdr/>
-        <w:shd w:val="nil"/>
+        <w:shd w:val="nil" w:color="auto"/>
         <w:spacing/>
         <w:ind/>
         <w:rPr>
@@ -6691,12 +7736,13 @@
       <w:r>
         <w:rPr>
           <w:highlight w:val="none"/>
+          <w14:ligatures w14:val="none"/>
         </w:rPr>
       </w:r>
     </w:p>
     <w:p>
       <w:pPr>
-        <w:pStyle w:val="1_709"/>
+        <w:pStyle w:val="892"/>
         <w:pBdr/>
         <w:spacing/>
         <w:ind/>
@@ -6714,12 +7760,18 @@
       <w:r>
         <w:rPr>
           <w:highlight w:val="none"/>
+        </w:rPr>
+      </w:r>
+      <w:r>
+        <w:rPr>
+          <w:highlight w:val="none"/>
+          <w14:ligatures w14:val="none"/>
         </w:rPr>
       </w:r>
     </w:p>
     <w:p>
       <w:pPr>
-        <w:pStyle w:val="1_709"/>
+        <w:pStyle w:val="892"/>
         <w:pBdr/>
         <w:spacing/>
         <w:ind/>
@@ -6736,12 +7788,17 @@
       <w:r>
         <w:rPr>
           <w:highlight w:val="none"/>
+        </w:rPr>
+      </w:r>
+      <w:r>
+        <w:rPr>
+          <w14:ligatures w14:val="none"/>
         </w:rPr>
       </w:r>
     </w:p>
     <w:p>
       <w:pPr>
-        <w:pStyle w:val="1_709"/>
+        <w:pStyle w:val="892"/>
         <w:pBdr/>
         <w:spacing/>
         <w:ind/>
@@ -6758,12 +7815,17 @@
       <w:r>
         <w:rPr>
           <w:highlight w:val="none"/>
+        </w:rPr>
+      </w:r>
+      <w:r>
+        <w:rPr>
+          <w14:ligatures w14:val="none"/>
         </w:rPr>
       </w:r>
     </w:p>
     <w:p>
       <w:pPr>
-        <w:pStyle w:val="1_709"/>
+        <w:pStyle w:val="892"/>
         <w:pBdr/>
         <w:spacing/>
         <w:ind/>
@@ -6780,12 +7842,17 @@
       <w:r>
         <w:rPr>
           <w:highlight w:val="none"/>
+        </w:rPr>
+      </w:r>
+      <w:r>
+        <w:rPr>
+          <w14:ligatures w14:val="none"/>
         </w:rPr>
       </w:r>
     </w:p>
     <w:p>
       <w:pPr>
-        <w:pStyle w:val="1_709"/>
+        <w:pStyle w:val="892"/>
         <w:pBdr/>
         <w:spacing/>
         <w:ind/>
@@ -6802,12 +7869,17 @@
       <w:r>
         <w:rPr>
           <w:highlight w:val="none"/>
+        </w:rPr>
+      </w:r>
+      <w:r>
+        <w:rPr>
+          <w14:ligatures w14:val="none"/>
         </w:rPr>
       </w:r>
     </w:p>
     <w:p>
       <w:pPr>
-        <w:pStyle w:val="1_709"/>
+        <w:pStyle w:val="892"/>
         <w:pBdr/>
         <w:spacing/>
         <w:ind/>
@@ -6824,12 +7896,17 @@
       <w:r>
         <w:rPr>
           <w:highlight w:val="none"/>
+        </w:rPr>
+      </w:r>
+      <w:r>
+        <w:rPr>
+          <w14:ligatures w14:val="none"/>
         </w:rPr>
       </w:r>
     </w:p>
     <w:p>
       <w:pPr>
-        <w:pStyle w:val="1_709"/>
+        <w:pStyle w:val="892"/>
         <w:pBdr/>
         <w:spacing/>
         <w:ind/>
@@ -6846,12 +7923,17 @@
       <w:r>
         <w:rPr>
           <w:highlight w:val="none"/>
+        </w:rPr>
+      </w:r>
+      <w:r>
+        <w:rPr>
+          <w14:ligatures w14:val="none"/>
         </w:rPr>
       </w:r>
     </w:p>
     <w:p>
       <w:pPr>
-        <w:pStyle w:val="1_709"/>
+        <w:pStyle w:val="892"/>
         <w:pBdr/>
         <w:spacing/>
         <w:ind/>
@@ -6867,12 +7949,17 @@
       <w:r>
         <w:rPr>
           <w:highlight w:val="none"/>
+        </w:rPr>
+      </w:r>
+      <w:r>
+        <w:rPr>
+          <w14:ligatures w14:val="none"/>
         </w:rPr>
       </w:r>
     </w:p>
     <w:p>
       <w:pPr>
-        <w:pStyle w:val="1_709"/>
+        <w:pStyle w:val="892"/>
         <w:pBdr/>
         <w:spacing/>
         <w:ind/>
@@ -6889,12 +7976,17 @@
       <w:r>
         <w:rPr>
           <w:highlight w:val="none"/>
+        </w:rPr>
+      </w:r>
+      <w:r>
+        <w:rPr>
+          <w14:ligatures w14:val="none"/>
         </w:rPr>
       </w:r>
     </w:p>
     <w:p>
       <w:pPr>
-        <w:pStyle w:val="1_709"/>
+        <w:pStyle w:val="892"/>
         <w:pBdr/>
         <w:spacing/>
         <w:ind/>
@@ -6911,12 +8003,17 @@
       <w:r>
         <w:rPr>
           <w:highlight w:val="none"/>
+        </w:rPr>
+      </w:r>
+      <w:r>
+        <w:rPr>
+          <w14:ligatures w14:val="none"/>
         </w:rPr>
       </w:r>
     </w:p>
     <w:p>
       <w:pPr>
-        <w:pStyle w:val="1_709"/>
+        <w:pStyle w:val="892"/>
         <w:pBdr/>
         <w:spacing/>
         <w:ind/>
@@ -6933,12 +8030,17 @@
       <w:r>
         <w:rPr>
           <w:highlight w:val="none"/>
+        </w:rPr>
+      </w:r>
+      <w:r>
+        <w:rPr>
+          <w14:ligatures w14:val="none"/>
         </w:rPr>
       </w:r>
     </w:p>
     <w:p>
       <w:pPr>
-        <w:pStyle w:val="1_709"/>
+        <w:pStyle w:val="892"/>
         <w:pBdr/>
         <w:spacing/>
         <w:ind/>
@@ -6955,12 +8057,17 @@
       <w:r>
         <w:rPr>
           <w:highlight w:val="none"/>
+        </w:rPr>
+      </w:r>
+      <w:r>
+        <w:rPr>
+          <w14:ligatures w14:val="none"/>
         </w:rPr>
       </w:r>
     </w:p>
     <w:p>
       <w:pPr>
-        <w:pStyle w:val="1_709"/>
+        <w:pStyle w:val="892"/>
         <w:pBdr/>
         <w:spacing/>
         <w:ind/>
@@ -6977,12 +8084,17 @@
       <w:r>
         <w:rPr>
           <w:highlight w:val="none"/>
+        </w:rPr>
+      </w:r>
+      <w:r>
+        <w:rPr>
+          <w14:ligatures w14:val="none"/>
         </w:rPr>
       </w:r>
     </w:p>
     <w:p>
       <w:pPr>
-        <w:pStyle w:val="1_709"/>
+        <w:pStyle w:val="892"/>
         <w:pBdr/>
         <w:spacing/>
         <w:ind/>
@@ -6999,12 +8111,17 @@
       <w:r>
         <w:rPr>
           <w:highlight w:val="none"/>
+        </w:rPr>
+      </w:r>
+      <w:r>
+        <w:rPr>
+          <w14:ligatures w14:val="none"/>
         </w:rPr>
       </w:r>
     </w:p>
     <w:p>
       <w:pPr>
-        <w:pStyle w:val="1_709"/>
+        <w:pStyle w:val="892"/>
         <w:pBdr/>
         <w:spacing/>
         <w:ind/>
@@ -7021,12 +8138,17 @@
       <w:r>
         <w:rPr>
           <w:highlight w:val="none"/>
+        </w:rPr>
+      </w:r>
+      <w:r>
+        <w:rPr>
+          <w14:ligatures w14:val="none"/>
         </w:rPr>
       </w:r>
     </w:p>
     <w:p>
       <w:pPr>
-        <w:pStyle w:val="1_709"/>
+        <w:pStyle w:val="892"/>
         <w:pBdr/>
         <w:spacing/>
         <w:ind/>
@@ -7049,6 +8171,7 @@
       <w:r>
         <w:rPr>
           <w:highlight w:val="none"/>
+          <w14:ligatures w14:val="none"/>
         </w:rPr>
       </w:r>
     </w:p>
@@ -7075,6 +8198,7 @@
       <w:r>
         <w:rPr>
           <w:highlight w:val="none"/>
+          <w14:ligatures w14:val="none"/>
         </w:rPr>
       </w:r>
     </w:p>
@@ -7095,7 +8219,12 @@
         </w:rPr>
         <w:t xml:space="preserve">9 задание</w:t>
       </w:r>
-      <w:r/>
+      <w:r>
+        <w:rPr>
+          <w:highlight w:val="none"/>
+          <w14:ligatures w14:val="none"/>
+        </w:rPr>
+      </w:r>
     </w:p>
     <w:p>
       <w:pPr>
@@ -7106,11 +8235,6 @@
           <w14:ligatures w14:val="none"/>
         </w:rPr>
       </w:pPr>
-      <w:r>
-        <w:rPr>
-          <w:highlight w:val="none"/>
-        </w:rPr>
-      </w:r>
       <w:r>
         <w:rPr>
           <w:highlight w:val="none"/>
@@ -7131,7 +8255,7 @@
                   <a:graphicData uri="http://schemas.openxmlformats.org/drawingml/2006/picture">
                     <pic:pic xmlns:pic="http://schemas.openxmlformats.org/drawingml/2006/picture">
                       <pic:nvPicPr>
-                        <pic:cNvPr id="1604692125" name=""/>
+                        <pic:cNvPr id="1022374189" name=""/>
                         <pic:cNvPicPr>
                           <a:picLocks noChangeAspect="1"/>
                         </pic:cNvPicPr>
@@ -7144,7 +8268,7 @@
                       <pic:spPr bwMode="auto">
                         <a:xfrm flipH="0" flipV="0">
                           <a:off x="0" y="0"/>
-                          <a:ext cx="5943599" cy="2223301"/>
+                          <a:ext cx="5943598" cy="2223300"/>
                         </a:xfrm>
                         <a:prstGeom prst="rect">
                           <a:avLst/>
@@ -7190,9 +8314,15 @@
           <w:highlight w:val="none"/>
         </w:rPr>
       </w:r>
-      <w:r>
-        <w:rPr>
-          <w:highlight w:val="none"/>
+      <w:r/>
+      <w:r>
+        <w:rPr>
+          <w:highlight w:val="none"/>
+        </w:rPr>
+      </w:r>
+      <w:r>
+        <w:rPr>
+          <w14:ligatures w14:val="none"/>
         </w:rPr>
       </w:r>
     </w:p>
@@ -38073,9 +39203,9 @@
       <w:contextualSpacing w:val="true"/>
     </w:pPr>
   </w:style>
-  <w:style w:type="character" w:styleId="1_710" w:customStyle="1">
+  <w:style w:type="character" w:styleId="891" w:customStyle="1">
     <w:name w:val="Код_character"/>
-    <w:link w:val="1_709"/>
+    <w:link w:val="892"/>
     <w:pPr>
       <w:pBdr/>
       <w:spacing/>
@@ -38090,10 +39220,10 @@
       <w:lang w:val="ru-RU" w:bidi="ru-RU"/>
     </w:rPr>
   </w:style>
-  <w:style w:type="paragraph" w:styleId="1_709" w:customStyle="1">
+  <w:style w:type="paragraph" w:styleId="892" w:customStyle="1">
     <w:name w:val="Код"/>
     <w:basedOn w:val="886"/>
-    <w:link w:val="1_710"/>
+    <w:link w:val="891"/>
     <w:qFormat/>
     <w:pPr>
       <w:suppressLineNumbers w:val="false"/>
@@ -38102,7 +39232,7 @@
         <w:left w:val="single" w:color="000000" w:sz="8" w:space="0"/>
         <w:bottom w:val="single" w:color="000000" w:sz="8" w:space="0"/>
         <w:right w:val="single" w:color="000000" w:sz="8" w:space="0"/>
-        <w:between w:val="nil" w:color="000000" w:sz="4" w:space="0"/>
+        <w:between w:val="none" w:color="000000" w:sz="4" w:space="0"/>
       </w:pBdr>
       <w:spacing w:after="0" w:afterAutospacing="0" w:afterLines="0" w:line="240" w:lineRule="auto"/>
       <w:ind/>

</xml_diff>